<commit_message>
Fix golden exam typography, header spacing and print font loading
</commit_message>
<xml_diff>
--- a/templates/golden_tpl.docx
+++ b/templates/golden_tpl.docx
@@ -34,7 +34,7 @@
               <w:pStyle w:val="GoldenSource_Normal"/>
               <w:spacing w:beforeLines="20" w:before="72" w:afterLines="20" w:after="72"/>
               <w:rPr>
-                <w:rFonts w:ascii="LiHei Pro" w:eastAsia="LiHei Pro" w:hAnsi="DFKai-SB"/>
+                <w:rFonts w:ascii="Times New Roman" w:hAnsi="Times New Roman" w:eastAsia="DFPYuanMedium-B5" w:cs="Times New Roman"/>
               </w:rPr>
             </w:pPr>
             <w:bookmarkStart w:id="0" w:name="_Hlk240043766"/>
@@ -51,7 +51,7 @@
               <w:pStyle w:val="GoldenSource_Normal"/>
               <w:spacing w:beforeLines="20" w:before="72" w:afterLines="20" w:after="72"/>
               <w:rPr>
-                <w:rFonts w:eastAsia="芫荽"/>
+                <w:rFonts w:ascii="Times New Roman" w:hAnsi="Times New Roman" w:eastAsia="DFPYuanMedium-B5" w:cs="Times New Roman"/>
                 <w:b/>
                 <w:bCs/>
                 <w:sz w:val="28"/>
@@ -60,7 +60,7 @@
             </w:pPr>
             <w:r>
               <w:rPr>
-                <w:rFonts w:eastAsia="芫荽"/>
+                <w:rFonts w:ascii="Times New Roman" w:hAnsi="Times New Roman" w:eastAsia="DFPYuanMedium-B5" w:cs="Times New Roman"/>
                 <w:b/>
                 <w:bCs/>
                 <w:sz w:val="28"/>
@@ -80,7 +80,7 @@
               <w:spacing w:beforeLines="20" w:before="72" w:afterLines="20" w:after="72"/>
               <w:jc w:val="right"/>
               <w:rPr>
-                <w:rFonts w:eastAsia="芫荽"/>
+                <w:rFonts w:ascii="Times New Roman" w:hAnsi="Times New Roman" w:eastAsia="DFPYuanMedium-B5" w:cs="Times New Roman"/>
                 <w:b/>
                 <w:bCs/>
                 <w:sz w:val="28"/>
@@ -89,7 +89,7 @@
             </w:pPr>
             <w:r>
               <w:rPr>
-                <w:rFonts w:eastAsia="芫荽" w:hint="eastAsia"/>
+                <w:rFonts w:ascii="Times New Roman" w:hAnsi="Times New Roman" w:eastAsia="DFPYuanMedium-B5" w:cs="Times New Roman"/>
                 <w:b/>
                 <w:bCs/>
                 <w:sz w:val="28"/>
@@ -111,7 +111,7 @@
               <w:pStyle w:val="GoldenSource_Normal"/>
               <w:spacing w:beforeLines="20" w:before="72" w:afterLines="20" w:after="72"/>
               <w:rPr>
-                <w:rFonts w:ascii="LiHei Pro" w:eastAsia="LiHei Pro" w:hAnsi="DFKai-SB"/>
+                <w:rFonts w:ascii="Times New Roman" w:hAnsi="Times New Roman" w:eastAsia="DFPYuanMedium-B5" w:cs="Times New Roman"/>
               </w:rPr>
             </w:pPr>
           </w:p>
@@ -125,7 +125,7 @@
               <w:pStyle w:val="GoldenSource_Normal"/>
               <w:spacing w:beforeLines="20" w:before="72" w:afterLines="20" w:after="72"/>
               <w:rPr>
-                <w:rFonts w:eastAsia="芫荽"/>
+                <w:rFonts w:ascii="Times New Roman" w:hAnsi="Times New Roman" w:eastAsia="DFPYuanMedium-B5" w:cs="Times New Roman"/>
                 <w:b/>
                 <w:bCs/>
                 <w:sz w:val="28"/>
@@ -134,7 +134,7 @@
             </w:pPr>
             <w:r>
               <w:rPr>
-                <w:rFonts w:eastAsia="芫荽" w:hint="eastAsia"/>
+                <w:rFonts w:ascii="Times New Roman" w:hAnsi="Times New Roman" w:eastAsia="DFPYuanMedium-B5" w:cs="Times New Roman"/>
                 <w:b/>
                 <w:bCs/>
                 <w:sz w:val="28"/>
@@ -155,7 +155,7 @@
               <w:spacing w:beforeLines="20" w:before="72" w:afterLines="20" w:after="72"/>
               <w:jc w:val="right"/>
               <w:rPr>
-                <w:rFonts w:eastAsia="芫荽"/>
+                <w:rFonts w:ascii="Times New Roman" w:hAnsi="Times New Roman" w:eastAsia="DFPYuanMedium-B5" w:cs="Times New Roman"/>
                 <w:b/>
                 <w:bCs/>
                 <w:sz w:val="28"/>
@@ -164,7 +164,7 @@
             </w:pPr>
             <w:r>
               <w:rPr>
-                <w:rFonts w:eastAsia="芫荽" w:hint="eastAsia"/>
+                <w:rFonts w:ascii="Times New Roman" w:hAnsi="Times New Roman" w:eastAsia="DFPYuanMedium-B5" w:cs="Times New Roman"/>
                 <w:b/>
                 <w:bCs/>
                 <w:sz w:val="28"/>
@@ -186,7 +186,7 @@
               <w:spacing w:beforeLines="20" w:before="72" w:afterLines="20" w:after="72"/>
               <w:jc w:val="center"/>
               <w:rPr>
-                <w:rFonts w:ascii="LiHei Pro" w:eastAsia="LiHei Pro" w:hAnsi="DFKai-SB"/>
+                <w:rFonts w:ascii="Times New Roman" w:hAnsi="Times New Roman" w:eastAsia="DFPYuanMedium-B5" w:cs="Times New Roman"/>
               </w:rPr>
             </w:pPr>
           </w:p>
@@ -202,7 +202,7 @@
               <w:spacing w:beforeLines="20" w:before="72" w:afterLines="20" w:after="72"/>
               <w:jc w:val="right"/>
               <w:rPr>
-                <w:rFonts w:eastAsia="芫荽"/>
+                <w:rFonts w:ascii="Times New Roman" w:hAnsi="Times New Roman" w:eastAsia="DFPYuanMedium-B5" w:cs="Times New Roman"/>
                 <w:b/>
                 <w:bCs/>
                 <w:sz w:val="28"/>
@@ -211,7 +211,7 @@
             </w:pPr>
             <w:r>
               <w:rPr>
-                <w:rFonts w:eastAsia="芫荽" w:hint="eastAsia"/>
+                <w:rFonts w:ascii="Times New Roman" w:hAnsi="Times New Roman" w:eastAsia="DFPYuanMedium-B5" w:cs="Times New Roman"/>
                 <w:b/>
                 <w:bCs/>
                 <w:sz w:val="28"/>
@@ -221,7 +221,7 @@
             </w:r>
             <w:r>
               <w:rPr>
-                <w:rFonts w:eastAsia="芫荽" w:hint="eastAsia"/>
+                <w:rFonts w:ascii="Times New Roman" w:hAnsi="Times New Roman" w:eastAsia="DFPYuanMedium-B5" w:cs="Times New Roman"/>
                 <w:b/>
                 <w:bCs/>
                 <w:sz w:val="28"/>
@@ -231,7 +231,7 @@
             </w:r>
             <w:r>
               <w:rPr>
-                <w:rFonts w:eastAsia="芫荽" w:hint="eastAsia"/>
+                <w:rFonts w:ascii="Times New Roman" w:hAnsi="Times New Roman" w:eastAsia="DFPYuanMedium-B5" w:cs="Times New Roman"/>
                 <w:b/>
                 <w:bCs/>
                 <w:sz w:val="28"/>
@@ -241,7 +241,7 @@
             </w:r>
             <w:r>
               <w:rPr>
-                <w:rFonts w:eastAsia="芫荽" w:hint="eastAsia"/>
+                <w:rFonts w:ascii="Times New Roman" w:hAnsi="Times New Roman" w:eastAsia="DFPYuanMedium-B5" w:cs="Times New Roman"/>
                 <w:b/>
                 <w:bCs/>
                 <w:sz w:val="28"/>
@@ -251,7 +251,7 @@
             </w:r>
             <w:r>
               <w:rPr>
-                <w:rFonts w:eastAsia="芫荽" w:hint="eastAsia"/>
+                <w:rFonts w:ascii="Times New Roman" w:hAnsi="Times New Roman" w:eastAsia="DFPYuanMedium-B5" w:cs="Times New Roman"/>
                 <w:b/>
                 <w:bCs/>
                 <w:sz w:val="28"/>
@@ -261,7 +261,7 @@
             </w:r>
             <w:r>
               <w:rPr>
-                <w:rFonts w:eastAsia="芫荽" w:hint="eastAsia"/>
+                <w:rFonts w:ascii="Times New Roman" w:hAnsi="Times New Roman" w:eastAsia="DFPYuanMedium-B5" w:cs="Times New Roman"/>
                 <w:b/>
                 <w:bCs/>
                 <w:sz w:val="28"/>
@@ -271,7 +271,7 @@
             </w:r>
             <w:r>
               <w:rPr>
-                <w:rFonts w:eastAsia="芫荽" w:hint="eastAsia"/>
+                <w:rFonts w:ascii="Times New Roman" w:hAnsi="Times New Roman" w:eastAsia="DFPYuanMedium-B5" w:cs="Times New Roman"/>
                 <w:b/>
                 <w:bCs/>
                 <w:sz w:val="28"/>
@@ -281,7 +281,7 @@
             </w:r>
             <w:r>
               <w:rPr>
-                <w:rFonts w:eastAsia="芫荽" w:hint="eastAsia"/>
+                <w:rFonts w:ascii="Times New Roman" w:hAnsi="Times New Roman" w:eastAsia="DFPYuanMedium-B5" w:cs="Times New Roman"/>
                 <w:b/>
                 <w:bCs/>
                 <w:sz w:val="28"/>
@@ -291,7 +291,7 @@
             </w:r>
             <w:r>
               <w:rPr>
-                <w:rFonts w:eastAsia="芫荽" w:hint="eastAsia"/>
+                <w:rFonts w:ascii="Times New Roman" w:hAnsi="Times New Roman" w:eastAsia="DFPYuanMedium-B5" w:cs="Times New Roman"/>
                 <w:b/>
                 <w:bCs/>
                 <w:sz w:val="28"/>
@@ -301,7 +301,7 @@
             </w:r>
             <w:r>
               <w:rPr>
-                <w:rFonts w:eastAsia="芫荽" w:hint="eastAsia"/>
+                <w:rFonts w:ascii="Times New Roman" w:hAnsi="Times New Roman" w:eastAsia="DFPYuanMedium-B5" w:cs="Times New Roman"/>
                 <w:b/>
                 <w:bCs/>
                 <w:sz w:val="28"/>
@@ -311,7 +311,7 @@
             </w:r>
             <w:r>
               <w:rPr>
-                <w:rFonts w:eastAsia="芫荽" w:hint="eastAsia"/>
+                <w:rFonts w:ascii="Times New Roman" w:hAnsi="Times New Roman" w:eastAsia="DFPYuanMedium-B5" w:cs="Times New Roman"/>
                 <w:b/>
                 <w:bCs/>
                 <w:sz w:val="28"/>
@@ -321,7 +321,7 @@
             </w:r>
             <w:r>
               <w:rPr>
-                <w:rFonts w:eastAsia="芫荽" w:hint="eastAsia"/>
+                <w:rFonts w:ascii="Times New Roman" w:hAnsi="Times New Roman" w:eastAsia="DFPYuanMedium-B5" w:cs="Times New Roman"/>
                 <w:b/>
                 <w:bCs/>
                 <w:sz w:val="28"/>
@@ -339,12 +339,13 @@
         <w:autoSpaceDE/>
         <w:autoSpaceDN/>
         <w:rPr>
-          <w:rFonts w:ascii="DFKai-SB" w:eastAsia="DFKai-SB" w:hAnsi="DFKai-SB" w:cs="Times New Roman"/>
+          <w:rFonts w:ascii="Times New Roman" w:hAnsi="Times New Roman" w:eastAsia="DFPYuanMedium-B5" w:cs="Times New Roman"/>
         </w:rPr>
+        <w:spacing w:before="0" w:after="240" w:line="20" w:lineRule="exact"/>
       </w:pPr>
       <w:r>
         <w:rPr>
-          <w:rFonts w:ascii="LiHei Pro" w:eastAsia="LiHei Pro" w:hAnsi="DFKai-SB"/>
+          <w:rFonts w:ascii="Times New Roman" w:hAnsi="Times New Roman" w:eastAsia="DFPYuanMedium-B5" w:cs="Times New Roman"/>
           <w:noProof/>
         </w:rPr>
         <w:drawing>
@@ -409,9 +410,9 @@
         <w:tabs>
           <w:tab w:val="left" w:pos="0"/>
         </w:tabs>
-        <w:spacing w:after="120" w:line="288" w:lineRule="auto"/>
+        <w:spacing w:before="0" w:after="0" w:line="20" w:lineRule="exact"/>
         <w:rPr>
-          <w:rFonts w:eastAsia="DFPYuanMedium-B5"/>
+          <w:rFonts w:ascii="Times New Roman" w:hAnsi="Times New Roman" w:eastAsia="DFPYuanMedium-B5" w:cs="Times New Roman"/>
           <w:color w:val="000000" w:themeColor="text1"/>
           <w:sz w:val="20"/>
           <w:szCs w:val="20"/>
@@ -436,9 +437,9 @@
           <w:tab w:val="left" w:pos="2977"/>
           <w:tab w:val="left" w:pos="4111"/>
         </w:tabs>
-        <w:spacing w:after="120" w:line="288" w:lineRule="auto"/>
+        <w:spacing w:before="0" w:after="0" w:line="20" w:lineRule="exact"/>
         <w:rPr>
-          <w:rFonts w:eastAsia="DFPYuanMedium-B5"/>
+          <w:rFonts w:ascii="Times New Roman" w:hAnsi="Times New Roman" w:eastAsia="DFPYuanMedium-B5" w:cs="Times New Roman"/>
           <w:color w:val="000000" w:themeColor="text1"/>
           <w:sz w:val="20"/>
           <w:szCs w:val="20"/>
@@ -473,14 +474,14 @@
         <w:spacing w:after="120" w:line="288" w:lineRule="auto"/>
         <w:ind w:left="284" w:hanging="567"/>
         <w:rPr>
-          <w:rFonts w:eastAsia="DFPYuanMedium-B5"/>
+          <w:rFonts w:ascii="Times New Roman" w:hAnsi="Times New Roman" w:eastAsia="DFPYuanMedium-B5" w:cs="Times New Roman"/>
           <w:sz w:val="20"/>
           <w:szCs w:val="20"/>
         </w:rPr>
       </w:pPr>
       <w:r>
         <w:rPr>
-          <w:rFonts w:ascii="Times New Roman" w:hAnsi="Times New Roman" w:eastAsia="DFPYuanMedium-B5" w:hint="eastAsia"/>
+          <w:rFonts w:ascii="Times New Roman" w:hAnsi="Times New Roman" w:eastAsia="DFPYuanMedium-B5" w:cs="Times New Roman"/>
           <w:sz w:val="24"/>
           <w:szCs w:val="24"/>
         </w:rPr>
@@ -488,7 +489,7 @@
       </w:r>
       <w:r>
         <w:rPr>
-          <w:rFonts w:ascii="Times New Roman" w:hAnsi="Times New Roman" w:eastAsia="DFPYuanMedium-B5"/>
+          <w:rFonts w:ascii="Times New Roman" w:hAnsi="Times New Roman" w:eastAsia="DFPYuanMedium-B5" w:cs="Times New Roman"/>
           <w:sz w:val="20"/>
           <w:szCs w:val="20"/>
         </w:rPr>
@@ -557,7 +558,7 @@
                         </w:pPr>
                         <w:r>
                           <w:rPr>
-                            <w:rFonts w:ascii="Times New Roman" w:hAnsi="Times New Roman" w:eastAsia="DFPYuanMedium-B5" w:hint="eastAsia"/>
+                            <w:rFonts w:ascii="Times New Roman" w:hAnsi="Times New Roman" w:eastAsia="DFPYuanMedium-B5" w:cs="Times New Roman"/>
                             <w:sz w:val="20"/>
                             <w:szCs w:val="20"/>
                           </w:rPr>
@@ -617,14 +618,14 @@
         <w:jc w:val="left"/>
         <w:outlineLvl w:val="9"/>
         <w:rPr>
-          <w:rFonts w:ascii="Times New Roman" w:hAnsi="Times New Roman" w:eastAsia="DFPYuanMedium-B5"/>
+          <w:rFonts w:ascii="Times New Roman" w:hAnsi="Times New Roman" w:eastAsia="DFPYuanMedium-B5" w:cs="Times New Roman"/>
           <w:sz w:val="20"/>
           <w:szCs w:val="20"/>
         </w:rPr>
       </w:pPr>
       <w:r>
         <w:rPr>
-          <w:rFonts w:ascii="Times New Roman" w:hAnsi="Times New Roman" w:eastAsia="DFPYuanMedium-B5" w:hint="eastAsia"/>
+          <w:rFonts w:ascii="Times New Roman" w:hAnsi="Times New Roman" w:eastAsia="DFPYuanMedium-B5" w:cs="Times New Roman"/>
           <w:sz w:val="20"/>
           <w:szCs w:val="20"/>
         </w:rPr>
@@ -690,7 +691,7 @@
       <w:pStyle w:val="GoldenSource_Footer"/>
       <w:jc w:val="center"/>
       <w:rPr>
-        <w:rFonts w:ascii="Times New Roman" w:eastAsia="華康中圓體" w:hAnsi="Times New Roman"/>
+        <w:rFonts w:ascii="Times New Roman" w:hAnsi="Times New Roman" w:eastAsia="DFPYuanMedium-B5" w:cs="Times New Roman"/>
         <w:sz w:val="24"/>
         <w:szCs w:val="24"/>
       </w:rPr>
@@ -698,7 +699,7 @@
     <w:r>
       <w:rPr>
         <w:rStyle w:val="GoldenSource_PageNumber"/>
-        <w:rFonts w:ascii="Times New Roman" w:eastAsia="華康中圓體" w:hAnsi="Times New Roman" w:hint="eastAsia"/>
+        <w:rFonts w:ascii="Times New Roman" w:hAnsi="Times New Roman" w:eastAsia="DFPYuanMedium-B5" w:cs="Times New Roman"/>
         <w:sz w:val="24"/>
         <w:szCs w:val="24"/>
       </w:rPr>
@@ -707,7 +708,7 @@
     <w:r>
       <w:rPr>
         <w:rStyle w:val="GoldenSource_PageNumber"/>
-        <w:rFonts w:ascii="Times New Roman" w:eastAsia="華康中圓體" w:hAnsi="Times New Roman" w:hint="eastAsia"/>
+        <w:rFonts w:ascii="Times New Roman" w:hAnsi="Times New Roman" w:eastAsia="DFPYuanMedium-B5" w:cs="Times New Roman"/>
         <w:sz w:val="24"/>
         <w:szCs w:val="24"/>
       </w:rPr>
@@ -723,7 +724,7 @@
       </w:sdtPr>
       <w:sdtEndPr>
         <w:rPr>
-          <w:rFonts w:ascii="Times New Roman" w:hAnsi="Times New Roman" w:cs="Times New Roman"/>
+          <w:rFonts w:ascii="Times New Roman" w:hAnsi="Times New Roman" w:eastAsia="DFPYuanMedium-B5" w:cs="Times New Roman"/>
           <w:sz w:val="24"/>
           <w:szCs w:val="24"/>
         </w:rPr>
@@ -731,7 +732,7 @@
       <w:sdtContent>
         <w:r>
           <w:rPr>
-            <w:rFonts w:ascii="Times New Roman" w:hAnsi="Times New Roman" w:cs="Times New Roman"/>
+            <w:rFonts w:ascii="Times New Roman" w:hAnsi="Times New Roman" w:eastAsia="DFPYuanMedium-B5" w:cs="Times New Roman"/>
             <w:sz w:val="24"/>
             <w:szCs w:val="24"/>
           </w:rPr>
@@ -739,7 +740,7 @@
         </w:r>
         <w:r>
           <w:rPr>
-            <w:rFonts w:ascii="Times New Roman" w:hAnsi="Times New Roman" w:cs="Times New Roman"/>
+            <w:rFonts w:ascii="Times New Roman" w:hAnsi="Times New Roman" w:eastAsia="DFPYuanMedium-B5" w:cs="Times New Roman"/>
             <w:sz w:val="24"/>
             <w:szCs w:val="24"/>
           </w:rPr>
@@ -747,7 +748,7 @@
         </w:r>
         <w:r>
           <w:rPr>
-            <w:rFonts w:ascii="Times New Roman" w:hAnsi="Times New Roman" w:cs="Times New Roman"/>
+            <w:rFonts w:ascii="Times New Roman" w:hAnsi="Times New Roman" w:eastAsia="DFPYuanMedium-B5" w:cs="Times New Roman"/>
             <w:sz w:val="24"/>
             <w:szCs w:val="24"/>
           </w:rPr>
@@ -755,7 +756,7 @@
         </w:r>
         <w:r>
           <w:rPr>
-            <w:rFonts w:ascii="Times New Roman" w:hAnsi="Times New Roman" w:cs="Times New Roman"/>
+            <w:rFonts w:ascii="Times New Roman" w:hAnsi="Times New Roman" w:eastAsia="DFPYuanMedium-B5" w:cs="Times New Roman"/>
             <w:sz w:val="24"/>
             <w:szCs w:val="24"/>
             <w:lang w:val="zh-TW"/>
@@ -764,7 +765,7 @@
         </w:r>
         <w:r>
           <w:rPr>
-            <w:rFonts w:ascii="Times New Roman" w:hAnsi="Times New Roman" w:cs="Times New Roman"/>
+            <w:rFonts w:ascii="Times New Roman" w:hAnsi="Times New Roman" w:eastAsia="DFPYuanMedium-B5" w:cs="Times New Roman"/>
             <w:sz w:val="24"/>
             <w:szCs w:val="24"/>
           </w:rPr>
@@ -772,7 +773,7 @@
         </w:r>
         <w:r>
           <w:rPr>
-            <w:rFonts w:ascii="Times New Roman" w:hAnsi="Times New Roman" w:cs="Times New Roman" w:hint="eastAsia"/>
+            <w:rFonts w:ascii="Times New Roman" w:hAnsi="Times New Roman" w:eastAsia="DFPYuanMedium-B5" w:cs="Times New Roman"/>
             <w:sz w:val="24"/>
             <w:szCs w:val="24"/>
           </w:rPr>
@@ -780,7 +781,7 @@
         </w:r>
         <w:r>
           <w:rPr>
-            <w:rFonts w:ascii="華康中圓體" w:eastAsia="華康中圓體" w:hAnsi="Times New Roman" w:cs="Times New Roman" w:hint="eastAsia"/>
+            <w:rFonts w:ascii="Times New Roman" w:hAnsi="Times New Roman" w:eastAsia="DFPYuanMedium-B5" w:cs="Times New Roman"/>
             <w:sz w:val="24"/>
             <w:szCs w:val="24"/>
           </w:rPr>
@@ -804,7 +805,7 @@
       <w:pStyle w:val="GoldenSource_Footer"/>
       <w:jc w:val="center"/>
       <w:rPr>
-        <w:rFonts w:ascii="Times New Roman" w:eastAsia="華康中圓體" w:hAnsi="Times New Roman"/>
+        <w:rFonts w:ascii="Times New Roman" w:hAnsi="Times New Roman" w:eastAsia="DFPYuanMedium-B5" w:cs="Times New Roman"/>
         <w:sz w:val="24"/>
         <w:szCs w:val="24"/>
       </w:rPr>
@@ -812,7 +813,7 @@
     <w:r>
       <w:rPr>
         <w:rStyle w:val="GoldenSource_PageNumber"/>
-        <w:rFonts w:ascii="Times New Roman" w:eastAsia="華康中圓體" w:hAnsi="Times New Roman" w:hint="eastAsia"/>
+        <w:rFonts w:ascii="Times New Roman" w:hAnsi="Times New Roman" w:eastAsia="DFPYuanMedium-B5" w:cs="Times New Roman"/>
         <w:sz w:val="24"/>
         <w:szCs w:val="24"/>
       </w:rPr>
@@ -821,7 +822,7 @@
     <w:r>
       <w:rPr>
         <w:rStyle w:val="GoldenSource_PageNumber"/>
-        <w:rFonts w:ascii="Times New Roman" w:eastAsia="華康中圓體" w:hAnsi="Times New Roman" w:hint="eastAsia"/>
+        <w:rFonts w:ascii="Times New Roman" w:hAnsi="Times New Roman" w:eastAsia="DFPYuanMedium-B5" w:cs="Times New Roman"/>
         <w:sz w:val="24"/>
         <w:szCs w:val="24"/>
       </w:rPr>
@@ -837,7 +838,7 @@
       </w:sdtPr>
       <w:sdtEndPr>
         <w:rPr>
-          <w:rFonts w:ascii="Times New Roman" w:hAnsi="Times New Roman" w:cs="Times New Roman"/>
+          <w:rFonts w:ascii="Times New Roman" w:hAnsi="Times New Roman" w:eastAsia="DFPYuanMedium-B5" w:cs="Times New Roman"/>
           <w:sz w:val="24"/>
           <w:szCs w:val="24"/>
         </w:rPr>
@@ -845,7 +846,7 @@
       <w:sdtContent>
         <w:r>
           <w:rPr>
-            <w:rFonts w:ascii="Times New Roman" w:hAnsi="Times New Roman" w:cs="Times New Roman"/>
+            <w:rFonts w:ascii="Times New Roman" w:hAnsi="Times New Roman" w:eastAsia="DFPYuanMedium-B5" w:cs="Times New Roman"/>
             <w:sz w:val="24"/>
             <w:szCs w:val="24"/>
           </w:rPr>
@@ -853,7 +854,7 @@
         </w:r>
         <w:r>
           <w:rPr>
-            <w:rFonts w:ascii="Times New Roman" w:hAnsi="Times New Roman" w:cs="Times New Roman"/>
+            <w:rFonts w:ascii="Times New Roman" w:hAnsi="Times New Roman" w:eastAsia="DFPYuanMedium-B5" w:cs="Times New Roman"/>
             <w:sz w:val="24"/>
             <w:szCs w:val="24"/>
           </w:rPr>
@@ -861,7 +862,7 @@
         </w:r>
         <w:r>
           <w:rPr>
-            <w:rFonts w:ascii="Times New Roman" w:hAnsi="Times New Roman" w:cs="Times New Roman"/>
+            <w:rFonts w:ascii="Times New Roman" w:hAnsi="Times New Roman" w:eastAsia="DFPYuanMedium-B5" w:cs="Times New Roman"/>
             <w:sz w:val="24"/>
             <w:szCs w:val="24"/>
           </w:rPr>
@@ -869,7 +870,7 @@
         </w:r>
         <w:r>
           <w:rPr>
-            <w:rFonts w:ascii="Times New Roman" w:hAnsi="Times New Roman" w:cs="Times New Roman"/>
+            <w:rFonts w:ascii="Times New Roman" w:hAnsi="Times New Roman" w:eastAsia="DFPYuanMedium-B5" w:cs="Times New Roman"/>
             <w:sz w:val="24"/>
             <w:szCs w:val="24"/>
             <w:lang w:val="zh-TW"/>
@@ -878,7 +879,7 @@
         </w:r>
         <w:r>
           <w:rPr>
-            <w:rFonts w:ascii="Times New Roman" w:hAnsi="Times New Roman" w:cs="Times New Roman"/>
+            <w:rFonts w:ascii="Times New Roman" w:hAnsi="Times New Roman" w:eastAsia="DFPYuanMedium-B5" w:cs="Times New Roman"/>
             <w:sz w:val="24"/>
             <w:szCs w:val="24"/>
           </w:rPr>
@@ -886,7 +887,7 @@
         </w:r>
         <w:r>
           <w:rPr>
-            <w:rFonts w:ascii="Times New Roman" w:hAnsi="Times New Roman" w:cs="Times New Roman" w:hint="eastAsia"/>
+            <w:rFonts w:ascii="Times New Roman" w:hAnsi="Times New Roman" w:eastAsia="DFPYuanMedium-B5" w:cs="Times New Roman"/>
             <w:sz w:val="24"/>
             <w:szCs w:val="24"/>
           </w:rPr>
@@ -894,7 +895,7 @@
         </w:r>
         <w:r>
           <w:rPr>
-            <w:rFonts w:ascii="華康中圓體" w:eastAsia="華康中圓體" w:hAnsi="Times New Roman" w:cs="Times New Roman" w:hint="eastAsia"/>
+            <w:rFonts w:ascii="Times New Roman" w:hAnsi="Times New Roman" w:eastAsia="DFPYuanMedium-B5" w:cs="Times New Roman"/>
             <w:sz w:val="24"/>
             <w:szCs w:val="24"/>
           </w:rPr>
@@ -918,7 +919,7 @@
       <w:pStyle w:val="GoldenSource_Footer"/>
       <w:jc w:val="center"/>
       <w:rPr>
-        <w:rFonts w:ascii="Times New Roman" w:eastAsia="華康中圓體" w:hAnsi="Times New Roman"/>
+        <w:rFonts w:ascii="Times New Roman" w:hAnsi="Times New Roman" w:eastAsia="DFPYuanMedium-B5" w:cs="Times New Roman"/>
         <w:sz w:val="24"/>
         <w:szCs w:val="24"/>
       </w:rPr>
@@ -926,7 +927,7 @@
     <w:r>
       <w:rPr>
         <w:rStyle w:val="GoldenSource_PageNumber"/>
-        <w:rFonts w:ascii="Times New Roman" w:eastAsia="華康中圓體" w:hAnsi="Times New Roman" w:hint="eastAsia"/>
+        <w:rFonts w:ascii="Times New Roman" w:hAnsi="Times New Roman" w:eastAsia="DFPYuanMedium-B5" w:cs="Times New Roman"/>
         <w:sz w:val="24"/>
         <w:szCs w:val="24"/>
       </w:rPr>
@@ -935,7 +936,7 @@
     <w:r>
       <w:rPr>
         <w:rStyle w:val="GoldenSource_PageNumber"/>
-        <w:rFonts w:ascii="Times New Roman" w:eastAsia="華康中圓體" w:hAnsi="Times New Roman" w:hint="eastAsia"/>
+        <w:rFonts w:ascii="Times New Roman" w:hAnsi="Times New Roman" w:eastAsia="DFPYuanMedium-B5" w:cs="Times New Roman"/>
         <w:sz w:val="24"/>
         <w:szCs w:val="24"/>
       </w:rPr>
@@ -951,7 +952,7 @@
       </w:sdtPr>
       <w:sdtEndPr>
         <w:rPr>
-          <w:rFonts w:ascii="Times New Roman" w:hAnsi="Times New Roman" w:cs="Times New Roman"/>
+          <w:rFonts w:ascii="Times New Roman" w:hAnsi="Times New Roman" w:eastAsia="DFPYuanMedium-B5" w:cs="Times New Roman"/>
           <w:sz w:val="24"/>
           <w:szCs w:val="24"/>
         </w:rPr>
@@ -959,7 +960,7 @@
       <w:sdtContent>
         <w:r>
           <w:rPr>
-            <w:rFonts w:ascii="Times New Roman" w:hAnsi="Times New Roman" w:cs="Times New Roman"/>
+            <w:rFonts w:ascii="Times New Roman" w:hAnsi="Times New Roman" w:eastAsia="DFPYuanMedium-B5" w:cs="Times New Roman"/>
             <w:sz w:val="24"/>
             <w:szCs w:val="24"/>
           </w:rPr>
@@ -967,7 +968,7 @@
         </w:r>
         <w:r>
           <w:rPr>
-            <w:rFonts w:ascii="Times New Roman" w:hAnsi="Times New Roman" w:cs="Times New Roman"/>
+            <w:rFonts w:ascii="Times New Roman" w:hAnsi="Times New Roman" w:eastAsia="DFPYuanMedium-B5" w:cs="Times New Roman"/>
             <w:sz w:val="24"/>
             <w:szCs w:val="24"/>
           </w:rPr>
@@ -975,7 +976,7 @@
         </w:r>
         <w:r>
           <w:rPr>
-            <w:rFonts w:ascii="Times New Roman" w:hAnsi="Times New Roman" w:cs="Times New Roman"/>
+            <w:rFonts w:ascii="Times New Roman" w:hAnsi="Times New Roman" w:eastAsia="DFPYuanMedium-B5" w:cs="Times New Roman"/>
             <w:sz w:val="24"/>
             <w:szCs w:val="24"/>
           </w:rPr>
@@ -983,7 +984,7 @@
         </w:r>
         <w:r>
           <w:rPr>
-            <w:rFonts w:ascii="Times New Roman" w:hAnsi="Times New Roman" w:cs="Times New Roman"/>
+            <w:rFonts w:ascii="Times New Roman" w:hAnsi="Times New Roman" w:eastAsia="DFPYuanMedium-B5" w:cs="Times New Roman"/>
             <w:sz w:val="24"/>
             <w:szCs w:val="24"/>
             <w:lang w:val="zh-TW"/>
@@ -992,7 +993,7 @@
         </w:r>
         <w:r>
           <w:rPr>
-            <w:rFonts w:ascii="Times New Roman" w:hAnsi="Times New Roman" w:cs="Times New Roman"/>
+            <w:rFonts w:ascii="Times New Roman" w:hAnsi="Times New Roman" w:eastAsia="DFPYuanMedium-B5" w:cs="Times New Roman"/>
             <w:sz w:val="24"/>
             <w:szCs w:val="24"/>
           </w:rPr>
@@ -1000,7 +1001,7 @@
         </w:r>
         <w:r>
           <w:rPr>
-            <w:rFonts w:ascii="Times New Roman" w:hAnsi="Times New Roman" w:cs="Times New Roman" w:hint="eastAsia"/>
+            <w:rFonts w:ascii="Times New Roman" w:hAnsi="Times New Roman" w:eastAsia="DFPYuanMedium-B5" w:cs="Times New Roman"/>
             <w:sz w:val="24"/>
             <w:szCs w:val="24"/>
           </w:rPr>
@@ -1008,7 +1009,7 @@
         </w:r>
         <w:r>
           <w:rPr>
-            <w:rFonts w:ascii="華康中圓體" w:eastAsia="華康中圓體" w:hAnsi="Times New Roman" w:cs="Times New Roman" w:hint="eastAsia"/>
+            <w:rFonts w:ascii="Times New Roman" w:hAnsi="Times New Roman" w:eastAsia="DFPYuanMedium-B5" w:cs="Times New Roman"/>
             <w:sz w:val="24"/>
             <w:szCs w:val="24"/>
           </w:rPr>
@@ -1032,7 +1033,7 @@
       <w:pStyle w:val="GoldenSource_Footer"/>
       <w:jc w:val="center"/>
       <w:rPr>
-        <w:rFonts w:ascii="Times New Roman" w:eastAsia="華康中圓體" w:hAnsi="Times New Roman"/>
+        <w:rFonts w:ascii="Times New Roman" w:hAnsi="Times New Roman" w:eastAsia="DFPYuanMedium-B5" w:cs="Times New Roman"/>
         <w:sz w:val="24"/>
         <w:szCs w:val="24"/>
       </w:rPr>
@@ -1040,7 +1041,7 @@
     <w:r>
       <w:rPr>
         <w:rStyle w:val="GoldenSource_PageNumber"/>
-        <w:rFonts w:ascii="Times New Roman" w:eastAsia="華康中圓體" w:hAnsi="Times New Roman" w:hint="eastAsia"/>
+        <w:rFonts w:ascii="Times New Roman" w:hAnsi="Times New Roman" w:eastAsia="DFPYuanMedium-B5" w:cs="Times New Roman"/>
         <w:sz w:val="24"/>
         <w:szCs w:val="24"/>
       </w:rPr>
@@ -1049,7 +1050,7 @@
     <w:r>
       <w:rPr>
         <w:rStyle w:val="GoldenSource_PageNumber"/>
-        <w:rFonts w:ascii="Times New Roman" w:eastAsia="華康中圓體" w:hAnsi="Times New Roman" w:hint="eastAsia"/>
+        <w:rFonts w:ascii="Times New Roman" w:hAnsi="Times New Roman" w:eastAsia="DFPYuanMedium-B5" w:cs="Times New Roman"/>
         <w:sz w:val="24"/>
         <w:szCs w:val="24"/>
       </w:rPr>
@@ -1065,7 +1066,7 @@
       </w:sdtPr>
       <w:sdtEndPr>
         <w:rPr>
-          <w:rFonts w:ascii="Times New Roman" w:hAnsi="Times New Roman" w:cs="Times New Roman"/>
+          <w:rFonts w:ascii="Times New Roman" w:hAnsi="Times New Roman" w:eastAsia="DFPYuanMedium-B5" w:cs="Times New Roman"/>
           <w:sz w:val="24"/>
           <w:szCs w:val="24"/>
         </w:rPr>
@@ -1073,7 +1074,7 @@
       <w:sdtContent>
         <w:r>
           <w:rPr>
-            <w:rFonts w:ascii="Times New Roman" w:hAnsi="Times New Roman" w:cs="Times New Roman"/>
+            <w:rFonts w:ascii="Times New Roman" w:hAnsi="Times New Roman" w:eastAsia="DFPYuanMedium-B5" w:cs="Times New Roman"/>
             <w:sz w:val="24"/>
             <w:szCs w:val="24"/>
           </w:rPr>
@@ -1081,7 +1082,7 @@
         </w:r>
         <w:r>
           <w:rPr>
-            <w:rFonts w:ascii="Times New Roman" w:hAnsi="Times New Roman" w:cs="Times New Roman"/>
+            <w:rFonts w:ascii="Times New Roman" w:hAnsi="Times New Roman" w:eastAsia="DFPYuanMedium-B5" w:cs="Times New Roman"/>
             <w:sz w:val="24"/>
             <w:szCs w:val="24"/>
           </w:rPr>
@@ -1089,7 +1090,7 @@
         </w:r>
         <w:r>
           <w:rPr>
-            <w:rFonts w:ascii="Times New Roman" w:hAnsi="Times New Roman" w:cs="Times New Roman"/>
+            <w:rFonts w:ascii="Times New Roman" w:hAnsi="Times New Roman" w:eastAsia="DFPYuanMedium-B5" w:cs="Times New Roman"/>
             <w:sz w:val="24"/>
             <w:szCs w:val="24"/>
           </w:rPr>
@@ -1097,7 +1098,7 @@
         </w:r>
         <w:r>
           <w:rPr>
-            <w:rFonts w:ascii="Times New Roman" w:hAnsi="Times New Roman" w:cs="Times New Roman"/>
+            <w:rFonts w:ascii="Times New Roman" w:hAnsi="Times New Roman" w:eastAsia="DFPYuanMedium-B5" w:cs="Times New Roman"/>
             <w:sz w:val="24"/>
             <w:szCs w:val="24"/>
             <w:lang w:val="zh-TW"/>
@@ -1106,7 +1107,7 @@
         </w:r>
         <w:r>
           <w:rPr>
-            <w:rFonts w:ascii="Times New Roman" w:hAnsi="Times New Roman" w:cs="Times New Roman"/>
+            <w:rFonts w:ascii="Times New Roman" w:hAnsi="Times New Roman" w:eastAsia="DFPYuanMedium-B5" w:cs="Times New Roman"/>
             <w:sz w:val="24"/>
             <w:szCs w:val="24"/>
           </w:rPr>
@@ -1114,7 +1115,7 @@
         </w:r>
         <w:r>
           <w:rPr>
-            <w:rFonts w:ascii="Times New Roman" w:hAnsi="Times New Roman" w:cs="Times New Roman" w:hint="eastAsia"/>
+            <w:rFonts w:ascii="Times New Roman" w:hAnsi="Times New Roman" w:eastAsia="DFPYuanMedium-B5" w:cs="Times New Roman"/>
             <w:sz w:val="24"/>
             <w:szCs w:val="24"/>
           </w:rPr>
@@ -1122,7 +1123,7 @@
         </w:r>
         <w:r>
           <w:rPr>
-            <w:rFonts w:ascii="華康中圓體" w:eastAsia="華康中圓體" w:hAnsi="Times New Roman" w:cs="Times New Roman" w:hint="eastAsia"/>
+            <w:rFonts w:ascii="Times New Roman" w:hAnsi="Times New Roman" w:eastAsia="DFPYuanMedium-B5" w:cs="Times New Roman"/>
             <w:sz w:val="24"/>
             <w:szCs w:val="24"/>
           </w:rPr>
@@ -1186,7 +1187,7 @@
         <w:ind w:left="1406" w:hanging="360"/>
       </w:pPr>
       <w:rPr>
-        <w:rFonts w:hint="eastAsia"/>
+        <w:rFonts w:ascii="Times New Roman" w:hAnsi="Times New Roman" w:eastAsia="DFPYuanMedium-B5" w:cs="Times New Roman"/>
         <w:i w:val="0"/>
         <w:iCs/>
       </w:rPr>
@@ -1278,7 +1279,7 @@
         <w:ind w:left="720" w:hanging="360"/>
       </w:pPr>
       <w:rPr>
-        <w:rFonts w:hint="eastAsia"/>
+        <w:rFonts w:ascii="Times New Roman" w:hAnsi="Times New Roman" w:eastAsia="DFPYuanMedium-B5" w:cs="Times New Roman"/>
         <w:i w:val="0"/>
         <w:iCs/>
       </w:rPr>
@@ -1369,7 +1370,7 @@
         <w:ind w:left="720" w:hanging="360"/>
       </w:pPr>
       <w:rPr>
-        <w:rFonts w:hint="default"/>
+        <w:rFonts w:ascii="Times New Roman" w:hAnsi="Times New Roman" w:eastAsia="DFPYuanMedium-B5" w:cs="Times New Roman"/>
         <w:sz w:val="24"/>
         <w:szCs w:val="24"/>
       </w:rPr>
@@ -1460,7 +1461,7 @@
         <w:ind w:left="760" w:hanging="400"/>
       </w:pPr>
       <w:rPr>
-        <w:rFonts w:hint="eastAsia"/>
+        <w:rFonts w:ascii="Times New Roman" w:hAnsi="Times New Roman" w:eastAsia="DFPYuanMedium-B5" w:cs="Times New Roman"/>
         <w:b/>
       </w:rPr>
     </w:lvl>
@@ -1550,7 +1551,7 @@
         <w:ind w:left="480" w:hanging="480"/>
       </w:pPr>
       <w:rPr>
-        <w:rFonts w:hint="eastAsia"/>
+        <w:rFonts w:ascii="Times New Roman" w:hAnsi="Times New Roman" w:eastAsia="DFPYuanMedium-B5" w:cs="Times New Roman"/>
       </w:rPr>
     </w:lvl>
     <w:lvl w:ilvl="1" w:tplc="FFFFFFFF" w:tentative="1">
@@ -1639,7 +1640,7 @@
         <w:ind w:left="1146" w:hanging="360"/>
       </w:pPr>
       <w:rPr>
-        <w:rFonts w:hint="eastAsia"/>
+        <w:rFonts w:ascii="Times New Roman" w:hAnsi="Times New Roman" w:eastAsia="DFPYuanMedium-B5" w:cs="Times New Roman"/>
         <w:i w:val="0"/>
         <w:iCs/>
       </w:rPr>
@@ -1730,7 +1731,7 @@
         <w:ind w:left="360" w:hanging="360"/>
       </w:pPr>
       <w:rPr>
-        <w:rFonts w:hint="default"/>
+        <w:rFonts w:ascii="Times New Roman" w:hAnsi="Times New Roman" w:eastAsia="DFPYuanMedium-B5" w:cs="Times New Roman"/>
       </w:rPr>
     </w:lvl>
     <w:lvl w:ilvl="1" w:tplc="04090019" w:tentative="1">
@@ -1819,7 +1820,7 @@
         <w:ind w:left="1004" w:hanging="360"/>
       </w:pPr>
       <w:rPr>
-        <w:rFonts w:hint="eastAsia"/>
+        <w:rFonts w:ascii="Times New Roman" w:hAnsi="Times New Roman" w:eastAsia="DFPYuanMedium-B5" w:cs="Times New Roman"/>
         <w:i w:val="0"/>
         <w:iCs/>
       </w:rPr>
@@ -1964,7 +1965,7 @@
         <w:ind w:left="720" w:hanging="360"/>
       </w:pPr>
       <w:rPr>
-        <w:rFonts w:hint="eastAsia"/>
+        <w:rFonts w:ascii="Times New Roman" w:hAnsi="Times New Roman" w:eastAsia="DFPYuanMedium-B5" w:cs="Times New Roman"/>
         <w:i w:val="0"/>
         <w:iCs/>
       </w:rPr>
@@ -2055,7 +2056,7 @@
         <w:ind w:left="720" w:hanging="360"/>
       </w:pPr>
       <w:rPr>
-        <w:rFonts w:hint="default"/>
+        <w:rFonts w:ascii="Times New Roman" w:hAnsi="Times New Roman" w:eastAsia="DFPYuanMedium-B5" w:cs="Times New Roman"/>
       </w:rPr>
     </w:lvl>
     <w:lvl w:ilvl="1" w:tplc="04090019" w:tentative="1">
@@ -2144,7 +2145,7 @@
         <w:ind w:left="720" w:hanging="360"/>
       </w:pPr>
       <w:rPr>
-        <w:rFonts w:cs="Microsoft JhengHei" w:hint="default"/>
+        <w:rFonts w:ascii="Times New Roman" w:hAnsi="Times New Roman" w:eastAsia="DFPYuanMedium-B5" w:cs="Times New Roman"/>
       </w:rPr>
     </w:lvl>
     <w:lvl w:ilvl="1" w:tplc="04090019" w:tentative="1">
@@ -2233,7 +2234,7 @@
         <w:ind w:left="1146" w:hanging="360"/>
       </w:pPr>
       <w:rPr>
-        <w:rFonts w:hint="eastAsia"/>
+        <w:rFonts w:ascii="Times New Roman" w:hAnsi="Times New Roman" w:eastAsia="DFPYuanMedium-B5" w:cs="Times New Roman"/>
         <w:i w:val="0"/>
         <w:iCs/>
       </w:rPr>
@@ -2324,7 +2325,7 @@
         <w:ind w:left="218" w:hanging="360"/>
       </w:pPr>
       <w:rPr>
-        <w:rFonts w:eastAsia="華康中圓體(P)" w:hint="default"/>
+        <w:rFonts w:ascii="Times New Roman" w:hAnsi="Times New Roman" w:eastAsia="DFPYuanMedium-B5" w:cs="Times New Roman"/>
       </w:rPr>
     </w:lvl>
     <w:lvl w:ilvl="1" w:tplc="04090019" w:tentative="1">
@@ -2413,7 +2414,7 @@
         <w:ind w:left="720" w:hanging="360"/>
       </w:pPr>
       <w:rPr>
-        <w:rFonts w:hint="default"/>
+        <w:rFonts w:ascii="Times New Roman" w:hAnsi="Times New Roman" w:eastAsia="DFPYuanMedium-B5" w:cs="Times New Roman"/>
       </w:rPr>
     </w:lvl>
     <w:lvl w:ilvl="1" w:tplc="04090019" w:tentative="1">
@@ -2502,7 +2503,7 @@
         <w:ind w:left="360" w:hanging="360"/>
       </w:pPr>
       <w:rPr>
-        <w:rFonts w:hint="default"/>
+        <w:rFonts w:ascii="Times New Roman" w:hAnsi="Times New Roman" w:eastAsia="DFPYuanMedium-B5" w:cs="Times New Roman"/>
       </w:rPr>
     </w:lvl>
     <w:lvl w:ilvl="1" w:tplc="FFFFFFFF" w:tentative="1">
@@ -2591,7 +2592,7 @@
         <w:ind w:left="480" w:hanging="480"/>
       </w:pPr>
       <w:rPr>
-        <w:rFonts w:ascii="jf open 粉圓 1.1" w:eastAsia="jf open 粉圓 1.1" w:hAnsi="jf open 粉圓 1.1"/>
+        <w:rFonts w:ascii="Times New Roman" w:hAnsi="Times New Roman" w:eastAsia="DFPYuanMedium-B5" w:cs="Times New Roman"/>
       </w:rPr>
     </w:lvl>
     <w:lvl w:ilvl="1" w:tplc="FFFFFFFF">
@@ -2648,7 +2649,7 @@
         <w:ind w:left="338" w:hanging="480"/>
       </w:pPr>
       <w:rPr>
-        <w:rFonts w:hint="eastAsia"/>
+        <w:rFonts w:ascii="Times New Roman" w:hAnsi="Times New Roman" w:eastAsia="DFPYuanMedium-B5" w:cs="Times New Roman"/>
       </w:rPr>
     </w:lvl>
     <w:lvl w:ilvl="1" w:tplc="FFFFFFFF" w:tentative="1">
@@ -2737,7 +2738,7 @@
         <w:ind w:left="720" w:hanging="360"/>
       </w:pPr>
       <w:rPr>
-        <w:rFonts w:hint="eastAsia"/>
+        <w:rFonts w:ascii="Times New Roman" w:hAnsi="Times New Roman" w:eastAsia="DFPYuanMedium-B5" w:cs="Times New Roman"/>
         <w:i w:val="0"/>
         <w:iCs/>
       </w:rPr>
@@ -2828,7 +2829,7 @@
         <w:ind w:left="480" w:hanging="480"/>
       </w:pPr>
       <w:rPr>
-        <w:rFonts w:ascii="jf open 粉圓 1.1" w:eastAsia="jf open 粉圓 1.1" w:hAnsi="jf open 粉圓 1.1"/>
+        <w:rFonts w:ascii="Times New Roman" w:hAnsi="Times New Roman" w:eastAsia="DFPYuanMedium-B5" w:cs="Times New Roman"/>
       </w:rPr>
     </w:lvl>
     <w:lvl w:ilvl="1" w:tplc="FFFFFFFF">
@@ -2885,7 +2886,7 @@
         <w:ind w:left="720" w:hanging="360"/>
       </w:pPr>
       <w:rPr>
-        <w:rFonts w:hint="eastAsia"/>
+        <w:rFonts w:ascii="Times New Roman" w:hAnsi="Times New Roman" w:eastAsia="DFPYuanMedium-B5" w:cs="Times New Roman"/>
         <w:i w:val="0"/>
         <w:iCs/>
       </w:rPr>
@@ -2976,7 +2977,7 @@
         <w:ind w:left="480" w:hanging="480"/>
       </w:pPr>
       <w:rPr>
-        <w:rFonts w:hint="eastAsia"/>
+        <w:rFonts w:ascii="Times New Roman" w:hAnsi="Times New Roman" w:eastAsia="DFPYuanMedium-B5" w:cs="Times New Roman"/>
       </w:rPr>
     </w:lvl>
     <w:lvl w:ilvl="1" w:tplc="FFFFFFFF" w:tentative="1">
@@ -3066,7 +3067,7 @@
         <w:ind w:left="1146" w:hanging="360"/>
       </w:pPr>
       <w:rPr>
-        <w:rFonts w:hint="eastAsia"/>
+        <w:rFonts w:ascii="Times New Roman" w:hAnsi="Times New Roman" w:eastAsia="DFPYuanMedium-B5" w:cs="Times New Roman"/>
         <w:i w:val="0"/>
         <w:iCs/>
       </w:rPr>
@@ -3265,7 +3266,7 @@
         <w:ind w:left="360" w:hanging="360"/>
       </w:pPr>
       <w:rPr>
-        <w:rFonts w:hint="default"/>
+        <w:rFonts w:ascii="Times New Roman" w:hAnsi="Times New Roman" w:eastAsia="DFPYuanMedium-B5" w:cs="Times New Roman"/>
       </w:rPr>
     </w:lvl>
     <w:lvl w:ilvl="1" w:tplc="04090019" w:tentative="1">
@@ -3355,7 +3356,7 @@
         <w:ind w:left="1429" w:hanging="360"/>
       </w:pPr>
       <w:rPr>
-        <w:rFonts w:hint="eastAsia"/>
+        <w:rFonts w:ascii="Times New Roman" w:hAnsi="Times New Roman" w:eastAsia="DFPYuanMedium-B5" w:cs="Times New Roman"/>
         <w:i w:val="0"/>
         <w:iCs/>
       </w:rPr>
@@ -3446,7 +3447,7 @@
         <w:ind w:left="720" w:hanging="720"/>
       </w:pPr>
       <w:rPr>
-        <w:rFonts w:hint="default"/>
+        <w:rFonts w:ascii="Times New Roman" w:hAnsi="Times New Roman" w:eastAsia="DFPYuanMedium-B5" w:cs="Times New Roman"/>
       </w:rPr>
     </w:lvl>
     <w:lvl w:ilvl="1" w:tplc="FFFFFFFF" w:tentative="1">
@@ -3535,7 +3536,7 @@
         <w:ind w:left="360" w:hanging="360"/>
       </w:pPr>
       <w:rPr>
-        <w:rFonts w:hint="default"/>
+        <w:rFonts w:ascii="Times New Roman" w:hAnsi="Times New Roman" w:eastAsia="DFPYuanMedium-B5" w:cs="Times New Roman"/>
       </w:rPr>
     </w:lvl>
     <w:lvl w:ilvl="1" w:tplc="FFFFFFFF" w:tentative="1">
@@ -3624,7 +3625,7 @@
         <w:ind w:left="1406" w:hanging="360"/>
       </w:pPr>
       <w:rPr>
-        <w:rFonts w:hint="eastAsia"/>
+        <w:rFonts w:ascii="Times New Roman" w:hAnsi="Times New Roman" w:eastAsia="DFPYuanMedium-B5" w:cs="Times New Roman"/>
         <w:i w:val="0"/>
         <w:iCs/>
       </w:rPr>
@@ -3715,7 +3716,7 @@
         <w:ind w:left="720" w:hanging="360"/>
       </w:pPr>
       <w:rPr>
-        <w:rFonts w:hint="default"/>
+        <w:rFonts w:ascii="Times New Roman" w:hAnsi="Times New Roman" w:eastAsia="DFPYuanMedium-B5" w:cs="Times New Roman"/>
       </w:rPr>
     </w:lvl>
     <w:lvl w:ilvl="1" w:tplc="FFFFFFFF" w:tentative="1">
@@ -3804,7 +3805,7 @@
         <w:ind w:left="1211" w:hanging="360"/>
       </w:pPr>
       <w:rPr>
-        <w:rFonts w:hint="default"/>
+        <w:rFonts w:ascii="Times New Roman" w:hAnsi="Times New Roman" w:eastAsia="DFPYuanMedium-B5" w:cs="Times New Roman"/>
         <w:sz w:val="24"/>
         <w:szCs w:val="24"/>
       </w:rPr>
@@ -3895,7 +3896,7 @@
         <w:ind w:left="720" w:hanging="360"/>
       </w:pPr>
       <w:rPr>
-        <w:rFonts w:hint="eastAsia"/>
+        <w:rFonts w:ascii="Times New Roman" w:hAnsi="Times New Roman" w:eastAsia="DFPYuanMedium-B5" w:cs="Times New Roman"/>
         <w:i w:val="0"/>
         <w:iCs/>
       </w:rPr>
@@ -3989,7 +3990,7 @@
         <w:ind w:left="840" w:hanging="420"/>
       </w:pPr>
       <w:rPr>
-        <w:rFonts w:ascii="Times New Roman" w:eastAsia="Times New Roman" w:hAnsi="Times New Roman" w:cs="Times New Roman"/>
+        <w:rFonts w:ascii="Times New Roman" w:hAnsi="Times New Roman" w:eastAsia="DFPYuanMedium-B5" w:cs="Times New Roman"/>
         <w:color w:val="000000"/>
         <w:sz w:val="24"/>
         <w:bdr w:val="none" w:sz="0" w:space="0" w:color="auto"/>
@@ -4005,7 +4006,7 @@
         <w:ind w:left="1440" w:hanging="360"/>
       </w:pPr>
       <w:rPr>
-        <w:rFonts w:ascii="Times New Roman" w:eastAsia="Times New Roman" w:hAnsi="Times New Roman" w:cs="Times New Roman"/>
+        <w:rFonts w:ascii="Times New Roman" w:hAnsi="Times New Roman" w:eastAsia="DFPYuanMedium-B5" w:cs="Times New Roman"/>
       </w:rPr>
     </w:lvl>
     <w:lvl w:ilvl="2">
@@ -4017,7 +4018,7 @@
         <w:ind w:left="2160" w:hanging="360"/>
       </w:pPr>
       <w:rPr>
-        <w:rFonts w:ascii="Times New Roman" w:eastAsia="Times New Roman" w:hAnsi="Times New Roman" w:cs="Times New Roman"/>
+        <w:rFonts w:ascii="Times New Roman" w:hAnsi="Times New Roman" w:eastAsia="DFPYuanMedium-B5" w:cs="Times New Roman"/>
       </w:rPr>
     </w:lvl>
     <w:lvl w:ilvl="3">
@@ -4029,7 +4030,7 @@
         <w:ind w:left="2880" w:hanging="360"/>
       </w:pPr>
       <w:rPr>
-        <w:rFonts w:ascii="Times New Roman" w:eastAsia="Times New Roman" w:hAnsi="Times New Roman" w:cs="Times New Roman"/>
+        <w:rFonts w:ascii="Times New Roman" w:hAnsi="Times New Roman" w:eastAsia="DFPYuanMedium-B5" w:cs="Times New Roman"/>
       </w:rPr>
     </w:lvl>
     <w:lvl w:ilvl="4">
@@ -4041,7 +4042,7 @@
         <w:ind w:left="3600" w:hanging="360"/>
       </w:pPr>
       <w:rPr>
-        <w:rFonts w:ascii="Times New Roman" w:eastAsia="Times New Roman" w:hAnsi="Times New Roman" w:cs="Times New Roman"/>
+        <w:rFonts w:ascii="Times New Roman" w:hAnsi="Times New Roman" w:eastAsia="DFPYuanMedium-B5" w:cs="Times New Roman"/>
       </w:rPr>
     </w:lvl>
     <w:lvl w:ilvl="5">
@@ -4053,7 +4054,7 @@
         <w:ind w:left="4320" w:hanging="360"/>
       </w:pPr>
       <w:rPr>
-        <w:rFonts w:ascii="Times New Roman" w:eastAsia="Times New Roman" w:hAnsi="Times New Roman" w:cs="Times New Roman"/>
+        <w:rFonts w:ascii="Times New Roman" w:hAnsi="Times New Roman" w:eastAsia="DFPYuanMedium-B5" w:cs="Times New Roman"/>
       </w:rPr>
     </w:lvl>
     <w:lvl w:ilvl="6">
@@ -4065,7 +4066,7 @@
         <w:ind w:left="5040" w:hanging="360"/>
       </w:pPr>
       <w:rPr>
-        <w:rFonts w:ascii="Times New Roman" w:eastAsia="Times New Roman" w:hAnsi="Times New Roman" w:cs="Times New Roman"/>
+        <w:rFonts w:ascii="Times New Roman" w:hAnsi="Times New Roman" w:eastAsia="DFPYuanMedium-B5" w:cs="Times New Roman"/>
       </w:rPr>
     </w:lvl>
     <w:lvl w:ilvl="7">
@@ -4077,7 +4078,7 @@
         <w:ind w:left="5760" w:hanging="360"/>
       </w:pPr>
       <w:rPr>
-        <w:rFonts w:ascii="Times New Roman" w:eastAsia="Times New Roman" w:hAnsi="Times New Roman" w:cs="Times New Roman"/>
+        <w:rFonts w:ascii="Times New Roman" w:hAnsi="Times New Roman" w:eastAsia="DFPYuanMedium-B5" w:cs="Times New Roman"/>
       </w:rPr>
     </w:lvl>
     <w:lvl w:ilvl="8">
@@ -4089,7 +4090,7 @@
         <w:ind w:left="6480" w:hanging="360"/>
       </w:pPr>
       <w:rPr>
-        <w:rFonts w:ascii="Times New Roman" w:eastAsia="Times New Roman" w:hAnsi="Times New Roman" w:cs="Times New Roman"/>
+        <w:rFonts w:ascii="Times New Roman" w:hAnsi="Times New Roman" w:eastAsia="DFPYuanMedium-B5" w:cs="Times New Roman"/>
       </w:rPr>
     </w:lvl>
   </w:abstractNum>
@@ -4106,7 +4107,7 @@
         <w:ind w:left="1146" w:hanging="360"/>
       </w:pPr>
       <w:rPr>
-        <w:rFonts w:hint="eastAsia"/>
+        <w:rFonts w:ascii="Times New Roman" w:hAnsi="Times New Roman" w:eastAsia="DFPYuanMedium-B5" w:cs="Times New Roman"/>
         <w:i w:val="0"/>
         <w:iCs/>
       </w:rPr>
@@ -4197,7 +4198,7 @@
         <w:ind w:left="480" w:hanging="480"/>
       </w:pPr>
       <w:rPr>
-        <w:rFonts w:hint="eastAsia"/>
+        <w:rFonts w:ascii="Times New Roman" w:hAnsi="Times New Roman" w:eastAsia="DFPYuanMedium-B5" w:cs="Times New Roman"/>
       </w:rPr>
     </w:lvl>
     <w:lvl w:ilvl="1" w:tplc="FFFFFFFF" w:tentative="1">
@@ -4286,7 +4287,7 @@
         <w:ind w:left="480" w:hanging="480"/>
       </w:pPr>
       <w:rPr>
-        <w:rFonts w:hint="eastAsia"/>
+        <w:rFonts w:ascii="Times New Roman" w:hAnsi="Times New Roman" w:eastAsia="DFPYuanMedium-B5" w:cs="Times New Roman"/>
       </w:rPr>
     </w:lvl>
     <w:lvl w:ilvl="1" w:tplc="04090019" w:tentative="1">
@@ -4429,7 +4430,7 @@
         <w:ind w:left="720" w:hanging="360"/>
       </w:pPr>
       <w:rPr>
-        <w:rFonts w:hint="eastAsia"/>
+        <w:rFonts w:ascii="Times New Roman" w:hAnsi="Times New Roman" w:eastAsia="DFPYuanMedium-B5" w:cs="Times New Roman"/>
         <w:i w:val="0"/>
         <w:iCs/>
       </w:rPr>
@@ -4520,7 +4521,7 @@
         <w:ind w:left="480" w:hanging="480"/>
       </w:pPr>
       <w:rPr>
-        <w:rFonts w:hint="eastAsia"/>
+        <w:rFonts w:ascii="Times New Roman" w:hAnsi="Times New Roman" w:eastAsia="DFPYuanMedium-B5" w:cs="Times New Roman"/>
       </w:rPr>
     </w:lvl>
     <w:lvl w:ilvl="1" w:tplc="04090019" w:tentative="1">
@@ -4609,7 +4610,7 @@
         <w:ind w:left="1440" w:hanging="360"/>
       </w:pPr>
       <w:rPr>
-        <w:rFonts w:cs="Microsoft JhengHei" w:hint="default"/>
+        <w:rFonts w:ascii="Times New Roman" w:hAnsi="Times New Roman" w:eastAsia="DFPYuanMedium-B5" w:cs="Times New Roman"/>
       </w:rPr>
     </w:lvl>
     <w:lvl w:ilvl="1" w:tplc="04090019" w:tentative="1">
@@ -4698,7 +4699,7 @@
         <w:ind w:left="338" w:hanging="480"/>
       </w:pPr>
       <w:rPr>
-        <w:rFonts w:ascii="jf open 粉圓 1.1" w:eastAsia="jf open 粉圓 1.1" w:hAnsi="jf open 粉圓 1.1" w:hint="eastAsia"/>
+        <w:rFonts w:ascii="Times New Roman" w:hAnsi="Times New Roman" w:eastAsia="DFPYuanMedium-B5" w:cs="Times New Roman"/>
         <w:i w:val="0"/>
         <w:iCs/>
       </w:rPr>
@@ -4789,7 +4790,7 @@
         <w:ind w:left="720" w:hanging="360"/>
       </w:pPr>
       <w:rPr>
-        <w:rFonts w:hint="default"/>
+        <w:rFonts w:ascii="Times New Roman" w:hAnsi="Times New Roman" w:eastAsia="DFPYuanMedium-B5" w:cs="Times New Roman"/>
         <w:b/>
         <w:bCs/>
       </w:rPr>
@@ -4880,7 +4881,7 @@
         <w:ind w:left="840" w:hanging="480"/>
       </w:pPr>
       <w:rPr>
-        <w:rFonts w:hint="eastAsia"/>
+        <w:rFonts w:ascii="Times New Roman" w:hAnsi="Times New Roman" w:eastAsia="DFPYuanMedium-B5" w:cs="Times New Roman"/>
         <w:i w:val="0"/>
         <w:iCs/>
       </w:rPr>
@@ -4971,7 +4972,7 @@
         <w:ind w:left="1146" w:hanging="360"/>
       </w:pPr>
       <w:rPr>
-        <w:rFonts w:hint="eastAsia"/>
+        <w:rFonts w:ascii="Times New Roman" w:hAnsi="Times New Roman" w:eastAsia="DFPYuanMedium-B5" w:cs="Times New Roman"/>
         <w:i w:val="0"/>
         <w:iCs/>
       </w:rPr>
@@ -5062,7 +5063,7 @@
         <w:ind w:left="960" w:hanging="480"/>
       </w:pPr>
       <w:rPr>
-        <w:rFonts w:hint="eastAsia"/>
+        <w:rFonts w:ascii="Times New Roman" w:hAnsi="Times New Roman" w:eastAsia="DFPYuanMedium-B5" w:cs="Times New Roman"/>
         <w:i w:val="0"/>
         <w:iCs/>
       </w:rPr>
@@ -5207,7 +5208,7 @@
         <w:ind w:left="480" w:hanging="480"/>
       </w:pPr>
       <w:rPr>
-        <w:rFonts w:hint="eastAsia"/>
+        <w:rFonts w:ascii="Times New Roman" w:hAnsi="Times New Roman" w:eastAsia="DFPYuanMedium-B5" w:cs="Times New Roman"/>
       </w:rPr>
     </w:lvl>
     <w:lvl w:ilvl="1" w:tplc="04090019" w:tentative="1">
@@ -5296,7 +5297,7 @@
         <w:ind w:left="1146" w:hanging="360"/>
       </w:pPr>
       <w:rPr>
-        <w:rFonts w:hint="eastAsia"/>
+        <w:rFonts w:ascii="Times New Roman" w:hAnsi="Times New Roman" w:eastAsia="DFPYuanMedium-B5" w:cs="Times New Roman"/>
         <w:i w:val="0"/>
         <w:iCs/>
       </w:rPr>
@@ -5387,7 +5388,7 @@
         <w:ind w:left="480" w:hanging="480"/>
       </w:pPr>
       <w:rPr>
-        <w:rFonts w:hint="eastAsia"/>
+        <w:rFonts w:ascii="Times New Roman" w:hAnsi="Times New Roman" w:eastAsia="DFPYuanMedium-B5" w:cs="Times New Roman"/>
       </w:rPr>
     </w:lvl>
     <w:lvl w:ilvl="1" w:tplc="04090019" w:tentative="1">
@@ -5476,7 +5477,7 @@
         <w:ind w:left="578" w:hanging="360"/>
       </w:pPr>
       <w:rPr>
-        <w:rFonts w:hint="eastAsia"/>
+        <w:rFonts w:ascii="Times New Roman" w:hAnsi="Times New Roman" w:eastAsia="DFPYuanMedium-B5" w:cs="Times New Roman"/>
         <w:i w:val="0"/>
         <w:iCs/>
       </w:rPr>
@@ -5567,7 +5568,7 @@
         <w:ind w:left="480" w:hanging="480"/>
       </w:pPr>
       <w:rPr>
-        <w:rFonts w:ascii="jf open 粉圓 1.1" w:eastAsia="jf open 粉圓 1.1" w:hAnsi="jf open 粉圓 1.1"/>
+        <w:rFonts w:ascii="Times New Roman" w:hAnsi="Times New Roman" w:eastAsia="DFPYuanMedium-B5" w:cs="Times New Roman"/>
       </w:rPr>
     </w:lvl>
     <w:lvl w:ilvl="1" w:tplc="FFFFFFFF">
@@ -5624,7 +5625,7 @@
         <w:ind w:left="1631" w:hanging="360"/>
       </w:pPr>
       <w:rPr>
-        <w:rFonts w:hint="eastAsia"/>
+        <w:rFonts w:ascii="Times New Roman" w:hAnsi="Times New Roman" w:eastAsia="DFPYuanMedium-B5" w:cs="Times New Roman"/>
         <w:i w:val="0"/>
         <w:iCs/>
       </w:rPr>
@@ -5715,7 +5716,7 @@
         <w:ind w:left="862" w:hanging="360"/>
       </w:pPr>
       <w:rPr>
-        <w:rFonts w:hint="eastAsia"/>
+        <w:rFonts w:ascii="Times New Roman" w:hAnsi="Times New Roman" w:eastAsia="DFPYuanMedium-B5" w:cs="Times New Roman"/>
         <w:i w:val="0"/>
         <w:iCs/>
       </w:rPr>
@@ -5806,7 +5807,7 @@
         <w:ind w:left="338" w:hanging="480"/>
       </w:pPr>
       <w:rPr>
-        <w:rFonts w:hint="eastAsia"/>
+        <w:rFonts w:ascii="Times New Roman" w:hAnsi="Times New Roman" w:eastAsia="DFPYuanMedium-B5" w:cs="Times New Roman"/>
       </w:rPr>
     </w:lvl>
     <w:lvl w:ilvl="1" w:tplc="04090019" w:tentative="1">
@@ -5895,7 +5896,7 @@
         <w:ind w:left="360" w:hanging="360"/>
       </w:pPr>
       <w:rPr>
-        <w:rFonts w:hint="default"/>
+        <w:rFonts w:ascii="Times New Roman" w:hAnsi="Times New Roman" w:eastAsia="DFPYuanMedium-B5" w:cs="Times New Roman"/>
       </w:rPr>
     </w:lvl>
     <w:lvl w:ilvl="1" w:tplc="04090019" w:tentative="1">
@@ -6038,7 +6039,7 @@
         <w:ind w:left="480" w:hanging="480"/>
       </w:pPr>
       <w:rPr>
-        <w:rFonts w:hint="eastAsia"/>
+        <w:rFonts w:ascii="Times New Roman" w:hAnsi="Times New Roman" w:eastAsia="DFPYuanMedium-B5" w:cs="Times New Roman"/>
       </w:rPr>
     </w:lvl>
     <w:lvl w:ilvl="1" w:tplc="FFFFFFFF" w:tentative="1">
@@ -6127,7 +6128,7 @@
         <w:ind w:left="720" w:hanging="360"/>
       </w:pPr>
       <w:rPr>
-        <w:rFonts w:hint="eastAsia"/>
+        <w:rFonts w:ascii="Times New Roman" w:hAnsi="Times New Roman" w:eastAsia="DFPYuanMedium-B5" w:cs="Times New Roman"/>
         <w:i w:val="0"/>
         <w:iCs/>
       </w:rPr>
@@ -6218,7 +6219,7 @@
         <w:ind w:left="720" w:hanging="360"/>
       </w:pPr>
       <w:rPr>
-        <w:rFonts w:hint="default"/>
+        <w:rFonts w:ascii="Times New Roman" w:hAnsi="Times New Roman" w:eastAsia="DFPYuanMedium-B5" w:cs="Times New Roman"/>
       </w:rPr>
     </w:lvl>
     <w:lvl w:ilvl="1" w:tplc="FFFFFFFF" w:tentative="1">
@@ -6307,7 +6308,7 @@
         <w:ind w:left="1429" w:hanging="360"/>
       </w:pPr>
       <w:rPr>
-        <w:rFonts w:hint="eastAsia"/>
+        <w:rFonts w:ascii="Times New Roman" w:hAnsi="Times New Roman" w:eastAsia="DFPYuanMedium-B5" w:cs="Times New Roman"/>
         <w:i w:val="0"/>
         <w:iCs/>
       </w:rPr>
@@ -6398,7 +6399,7 @@
         <w:ind w:left="480" w:hanging="480"/>
       </w:pPr>
       <w:rPr>
-        <w:rFonts w:hint="eastAsia"/>
+        <w:rFonts w:ascii="Times New Roman" w:hAnsi="Times New Roman" w:eastAsia="DFPYuanMedium-B5" w:cs="Times New Roman"/>
       </w:rPr>
     </w:lvl>
     <w:lvl w:ilvl="1" w:tplc="04090019" w:tentative="1">
@@ -6541,7 +6542,7 @@
         <w:ind w:left="720" w:hanging="360"/>
       </w:pPr>
       <w:rPr>
-        <w:rFonts w:hint="default"/>
+        <w:rFonts w:ascii="Times New Roman" w:hAnsi="Times New Roman" w:eastAsia="DFPYuanMedium-B5" w:cs="Times New Roman"/>
       </w:rPr>
     </w:lvl>
     <w:lvl w:ilvl="1" w:tplc="04090019" w:tentative="1">
@@ -6630,7 +6631,7 @@
         <w:ind w:left="760" w:hanging="400"/>
       </w:pPr>
       <w:rPr>
-        <w:rFonts w:hint="eastAsia"/>
+        <w:rFonts w:ascii="Times New Roman" w:hAnsi="Times New Roman" w:eastAsia="DFPYuanMedium-B5" w:cs="Times New Roman"/>
         <w:b/>
       </w:rPr>
     </w:lvl>
@@ -6720,7 +6721,7 @@
         <w:ind w:left="480" w:hanging="480"/>
       </w:pPr>
       <w:rPr>
-        <w:rFonts w:hint="eastAsia"/>
+        <w:rFonts w:ascii="Times New Roman" w:hAnsi="Times New Roman" w:eastAsia="DFPYuanMedium-B5" w:cs="Times New Roman"/>
       </w:rPr>
     </w:lvl>
     <w:lvl w:ilvl="1" w:tplc="FFFFFFFF" w:tentative="1">
@@ -6864,7 +6865,7 @@
         <w:ind w:left="720" w:hanging="360"/>
       </w:pPr>
       <w:rPr>
-        <w:rFonts w:hint="default"/>
+        <w:rFonts w:ascii="Times New Roman" w:hAnsi="Times New Roman" w:eastAsia="DFPYuanMedium-B5" w:cs="Times New Roman"/>
       </w:rPr>
     </w:lvl>
     <w:lvl w:ilvl="1">
@@ -7010,7 +7011,7 @@
         <w:ind w:left="840" w:hanging="420"/>
       </w:pPr>
       <w:rPr>
-        <w:rFonts w:ascii="Times New Roman" w:eastAsia="Times New Roman" w:hAnsi="Times New Roman" w:cs="Times New Roman"/>
+        <w:rFonts w:ascii="Times New Roman" w:hAnsi="Times New Roman" w:eastAsia="DFPYuanMedium-B5" w:cs="Times New Roman"/>
         <w:color w:val="000000"/>
         <w:sz w:val="24"/>
         <w:bdr w:val="none" w:sz="0" w:space="0" w:color="auto"/>
@@ -7026,7 +7027,7 @@
         <w:ind w:left="1440" w:hanging="360"/>
       </w:pPr>
       <w:rPr>
-        <w:rFonts w:ascii="Times New Roman" w:eastAsia="Times New Roman" w:hAnsi="Times New Roman" w:cs="Times New Roman"/>
+        <w:rFonts w:ascii="Times New Roman" w:hAnsi="Times New Roman" w:eastAsia="DFPYuanMedium-B5" w:cs="Times New Roman"/>
       </w:rPr>
     </w:lvl>
     <w:lvl w:ilvl="2">
@@ -7038,7 +7039,7 @@
         <w:ind w:left="2160" w:hanging="360"/>
       </w:pPr>
       <w:rPr>
-        <w:rFonts w:ascii="Times New Roman" w:eastAsia="Times New Roman" w:hAnsi="Times New Roman" w:cs="Times New Roman"/>
+        <w:rFonts w:ascii="Times New Roman" w:hAnsi="Times New Roman" w:eastAsia="DFPYuanMedium-B5" w:cs="Times New Roman"/>
       </w:rPr>
     </w:lvl>
     <w:lvl w:ilvl="3">
@@ -7050,7 +7051,7 @@
         <w:ind w:left="2880" w:hanging="360"/>
       </w:pPr>
       <w:rPr>
-        <w:rFonts w:ascii="Times New Roman" w:eastAsia="Times New Roman" w:hAnsi="Times New Roman" w:cs="Times New Roman"/>
+        <w:rFonts w:ascii="Times New Roman" w:hAnsi="Times New Roman" w:eastAsia="DFPYuanMedium-B5" w:cs="Times New Roman"/>
       </w:rPr>
     </w:lvl>
     <w:lvl w:ilvl="4">
@@ -7062,7 +7063,7 @@
         <w:ind w:left="3600" w:hanging="360"/>
       </w:pPr>
       <w:rPr>
-        <w:rFonts w:ascii="Times New Roman" w:eastAsia="Times New Roman" w:hAnsi="Times New Roman" w:cs="Times New Roman"/>
+        <w:rFonts w:ascii="Times New Roman" w:hAnsi="Times New Roman" w:eastAsia="DFPYuanMedium-B5" w:cs="Times New Roman"/>
       </w:rPr>
     </w:lvl>
     <w:lvl w:ilvl="5">
@@ -7074,7 +7075,7 @@
         <w:ind w:left="4320" w:hanging="360"/>
       </w:pPr>
       <w:rPr>
-        <w:rFonts w:ascii="Times New Roman" w:eastAsia="Times New Roman" w:hAnsi="Times New Roman" w:cs="Times New Roman"/>
+        <w:rFonts w:ascii="Times New Roman" w:hAnsi="Times New Roman" w:eastAsia="DFPYuanMedium-B5" w:cs="Times New Roman"/>
       </w:rPr>
     </w:lvl>
     <w:lvl w:ilvl="6">
@@ -7086,7 +7087,7 @@
         <w:ind w:left="5040" w:hanging="360"/>
       </w:pPr>
       <w:rPr>
-        <w:rFonts w:ascii="Times New Roman" w:eastAsia="Times New Roman" w:hAnsi="Times New Roman" w:cs="Times New Roman"/>
+        <w:rFonts w:ascii="Times New Roman" w:hAnsi="Times New Roman" w:eastAsia="DFPYuanMedium-B5" w:cs="Times New Roman"/>
       </w:rPr>
     </w:lvl>
     <w:lvl w:ilvl="7">
@@ -7098,7 +7099,7 @@
         <w:ind w:left="5760" w:hanging="360"/>
       </w:pPr>
       <w:rPr>
-        <w:rFonts w:ascii="Times New Roman" w:eastAsia="Times New Roman" w:hAnsi="Times New Roman" w:cs="Times New Roman"/>
+        <w:rFonts w:ascii="Times New Roman" w:hAnsi="Times New Roman" w:eastAsia="DFPYuanMedium-B5" w:cs="Times New Roman"/>
       </w:rPr>
     </w:lvl>
     <w:lvl w:ilvl="8">
@@ -7110,7 +7111,7 @@
         <w:ind w:left="6480" w:hanging="360"/>
       </w:pPr>
       <w:rPr>
-        <w:rFonts w:ascii="Times New Roman" w:eastAsia="Times New Roman" w:hAnsi="Times New Roman" w:cs="Times New Roman"/>
+        <w:rFonts w:ascii="Times New Roman" w:hAnsi="Times New Roman" w:eastAsia="DFPYuanMedium-B5" w:cs="Times New Roman"/>
       </w:rPr>
     </w:lvl>
   </w:abstractNum>
@@ -7127,7 +7128,7 @@
         <w:ind w:left="480" w:hanging="480"/>
       </w:pPr>
       <w:rPr>
-        <w:rFonts w:ascii="jf open 粉圓 1.1" w:eastAsia="jf open 粉圓 1.1" w:hAnsi="jf open 粉圓 1.1"/>
+        <w:rFonts w:ascii="Times New Roman" w:hAnsi="Times New Roman" w:eastAsia="DFPYuanMedium-B5" w:cs="Times New Roman"/>
       </w:rPr>
     </w:lvl>
     <w:lvl w:ilvl="1" w:tplc="395847DE">
@@ -7184,7 +7185,7 @@
         <w:ind w:left="720" w:hanging="360"/>
       </w:pPr>
       <w:rPr>
-        <w:rFonts w:hint="eastAsia"/>
+        <w:rFonts w:ascii="Times New Roman" w:hAnsi="Times New Roman" w:eastAsia="DFPYuanMedium-B5" w:cs="Times New Roman"/>
         <w:i w:val="0"/>
         <w:iCs/>
       </w:rPr>
@@ -7275,7 +7276,7 @@
         <w:ind w:left="480" w:hanging="480"/>
       </w:pPr>
       <w:rPr>
-        <w:rFonts w:hint="eastAsia"/>
+        <w:rFonts w:ascii="Times New Roman" w:hAnsi="Times New Roman" w:eastAsia="DFPYuanMedium-B5" w:cs="Times New Roman"/>
       </w:rPr>
     </w:lvl>
     <w:lvl w:ilvl="1" w:tplc="FFFFFFFF" w:tentative="1">
@@ -7364,7 +7365,7 @@
         <w:ind w:left="720" w:hanging="360"/>
       </w:pPr>
       <w:rPr>
-        <w:rFonts w:hint="eastAsia"/>
+        <w:rFonts w:ascii="Times New Roman" w:hAnsi="Times New Roman" w:eastAsia="DFPYuanMedium-B5" w:cs="Times New Roman"/>
         <w:i w:val="0"/>
         <w:iCs/>
       </w:rPr>
@@ -7455,7 +7456,7 @@
         <w:ind w:left="1146" w:hanging="360"/>
       </w:pPr>
       <w:rPr>
-        <w:rFonts w:hint="eastAsia"/>
+        <w:rFonts w:ascii="Times New Roman" w:hAnsi="Times New Roman" w:eastAsia="DFPYuanMedium-B5" w:cs="Times New Roman"/>
         <w:i w:val="0"/>
         <w:iCs/>
       </w:rPr>
@@ -7546,7 +7547,7 @@
         <w:ind w:left="720" w:hanging="360"/>
       </w:pPr>
       <w:rPr>
-        <w:rFonts w:eastAsia="華康中圓體(P)" w:hint="eastAsia"/>
+        <w:rFonts w:ascii="Times New Roman" w:hAnsi="Times New Roman" w:eastAsia="DFPYuanMedium-B5" w:cs="Times New Roman"/>
         <w:color w:val="auto"/>
         <w:sz w:val="24"/>
       </w:rPr>
@@ -7637,7 +7638,7 @@
         <w:ind w:left="480" w:hanging="480"/>
       </w:pPr>
       <w:rPr>
-        <w:rFonts w:hint="eastAsia"/>
+        <w:rFonts w:ascii="Times New Roman" w:hAnsi="Times New Roman" w:eastAsia="DFPYuanMedium-B5" w:cs="Times New Roman"/>
         <w:i w:val="0"/>
         <w:iCs/>
       </w:rPr>
@@ -7720,7 +7721,7 @@
         <w:ind w:left="1004" w:hanging="360"/>
       </w:pPr>
       <w:rPr>
-        <w:rFonts w:hint="default"/>
+        <w:rFonts w:ascii="Times New Roman" w:hAnsi="Times New Roman" w:eastAsia="DFPYuanMedium-B5" w:cs="Times New Roman"/>
       </w:rPr>
     </w:lvl>
     <w:lvl w:ilvl="1" w:tplc="04090019" w:tentative="1">
@@ -7809,7 +7810,7 @@
         <w:ind w:left="1146" w:hanging="360"/>
       </w:pPr>
       <w:rPr>
-        <w:rFonts w:hint="eastAsia"/>
+        <w:rFonts w:ascii="Times New Roman" w:hAnsi="Times New Roman" w:eastAsia="DFPYuanMedium-B5" w:cs="Times New Roman"/>
         <w:i w:val="0"/>
         <w:iCs/>
       </w:rPr>
@@ -7903,7 +7904,7 @@
         <w:ind w:left="400" w:firstLine="0"/>
       </w:pPr>
       <w:rPr>
-        <w:rFonts w:ascii="Times New Roman" w:eastAsia="Times New Roman" w:hAnsi="Times New Roman" w:cs="Times New Roman"/>
+        <w:rFonts w:ascii="Times New Roman" w:hAnsi="Times New Roman" w:eastAsia="DFPYuanMedium-B5" w:cs="Times New Roman"/>
         <w:color w:val="000000"/>
         <w:sz w:val="24"/>
         <w:bdr w:val="none" w:sz="0" w:space="0" w:color="auto"/>
@@ -7919,7 +7920,7 @@
         <w:ind w:left="1440" w:hanging="360"/>
       </w:pPr>
       <w:rPr>
-        <w:rFonts w:ascii="Times New Roman" w:eastAsia="Times New Roman" w:hAnsi="Times New Roman" w:cs="Times New Roman"/>
+        <w:rFonts w:ascii="Times New Roman" w:hAnsi="Times New Roman" w:eastAsia="DFPYuanMedium-B5" w:cs="Times New Roman"/>
       </w:rPr>
     </w:lvl>
     <w:lvl w:ilvl="2">
@@ -7931,7 +7932,7 @@
         <w:ind w:left="2160" w:hanging="360"/>
       </w:pPr>
       <w:rPr>
-        <w:rFonts w:ascii="Times New Roman" w:eastAsia="Times New Roman" w:hAnsi="Times New Roman" w:cs="Times New Roman"/>
+        <w:rFonts w:ascii="Times New Roman" w:hAnsi="Times New Roman" w:eastAsia="DFPYuanMedium-B5" w:cs="Times New Roman"/>
       </w:rPr>
     </w:lvl>
     <w:lvl w:ilvl="3">
@@ -7943,7 +7944,7 @@
         <w:ind w:left="2880" w:hanging="360"/>
       </w:pPr>
       <w:rPr>
-        <w:rFonts w:ascii="Times New Roman" w:eastAsia="Times New Roman" w:hAnsi="Times New Roman" w:cs="Times New Roman"/>
+        <w:rFonts w:ascii="Times New Roman" w:hAnsi="Times New Roman" w:eastAsia="DFPYuanMedium-B5" w:cs="Times New Roman"/>
       </w:rPr>
     </w:lvl>
     <w:lvl w:ilvl="4">
@@ -7955,7 +7956,7 @@
         <w:ind w:left="3600" w:hanging="360"/>
       </w:pPr>
       <w:rPr>
-        <w:rFonts w:ascii="Times New Roman" w:eastAsia="Times New Roman" w:hAnsi="Times New Roman" w:cs="Times New Roman"/>
+        <w:rFonts w:ascii="Times New Roman" w:hAnsi="Times New Roman" w:eastAsia="DFPYuanMedium-B5" w:cs="Times New Roman"/>
       </w:rPr>
     </w:lvl>
     <w:lvl w:ilvl="5">
@@ -7967,7 +7968,7 @@
         <w:ind w:left="4320" w:hanging="360"/>
       </w:pPr>
       <w:rPr>
-        <w:rFonts w:ascii="Times New Roman" w:eastAsia="Times New Roman" w:hAnsi="Times New Roman" w:cs="Times New Roman"/>
+        <w:rFonts w:ascii="Times New Roman" w:hAnsi="Times New Roman" w:eastAsia="DFPYuanMedium-B5" w:cs="Times New Roman"/>
       </w:rPr>
     </w:lvl>
     <w:lvl w:ilvl="6">
@@ -7979,7 +7980,7 @@
         <w:ind w:left="5040" w:hanging="360"/>
       </w:pPr>
       <w:rPr>
-        <w:rFonts w:ascii="Times New Roman" w:eastAsia="Times New Roman" w:hAnsi="Times New Roman" w:cs="Times New Roman"/>
+        <w:rFonts w:ascii="Times New Roman" w:hAnsi="Times New Roman" w:eastAsia="DFPYuanMedium-B5" w:cs="Times New Roman"/>
       </w:rPr>
     </w:lvl>
     <w:lvl w:ilvl="7">
@@ -7991,7 +7992,7 @@
         <w:ind w:left="5760" w:hanging="360"/>
       </w:pPr>
       <w:rPr>
-        <w:rFonts w:ascii="Times New Roman" w:eastAsia="Times New Roman" w:hAnsi="Times New Roman" w:cs="Times New Roman"/>
+        <w:rFonts w:ascii="Times New Roman" w:hAnsi="Times New Roman" w:eastAsia="DFPYuanMedium-B5" w:cs="Times New Roman"/>
       </w:rPr>
     </w:lvl>
     <w:lvl w:ilvl="8">
@@ -8003,7 +8004,7 @@
         <w:ind w:left="6480" w:hanging="360"/>
       </w:pPr>
       <w:rPr>
-        <w:rFonts w:ascii="Times New Roman" w:eastAsia="Times New Roman" w:hAnsi="Times New Roman" w:cs="Times New Roman"/>
+        <w:rFonts w:ascii="Times New Roman" w:hAnsi="Times New Roman" w:eastAsia="DFPYuanMedium-B5" w:cs="Times New Roman"/>
       </w:rPr>
     </w:lvl>
   </w:abstractNum>
@@ -8020,7 +8021,7 @@
         <w:ind w:left="720" w:hanging="360"/>
       </w:pPr>
       <w:rPr>
-        <w:rFonts w:hint="default"/>
+        <w:rFonts w:ascii="Times New Roman" w:hAnsi="Times New Roman" w:eastAsia="DFPYuanMedium-B5" w:cs="Times New Roman"/>
         <w:sz w:val="24"/>
         <w:szCs w:val="24"/>
       </w:rPr>
@@ -8111,7 +8112,7 @@
         <w:ind w:left="720" w:hanging="360"/>
       </w:pPr>
       <w:rPr>
-        <w:rFonts w:hint="default"/>
+        <w:rFonts w:ascii="Times New Roman" w:hAnsi="Times New Roman" w:eastAsia="DFPYuanMedium-B5" w:cs="Times New Roman"/>
       </w:rPr>
     </w:lvl>
     <w:lvl w:ilvl="1" w:tplc="FFFFFFFF" w:tentative="1">
@@ -8203,7 +8204,7 @@
         <w:ind w:left="840" w:hanging="420"/>
       </w:pPr>
       <w:rPr>
-        <w:rFonts w:ascii="Times New Roman" w:eastAsia="Times New Roman" w:hAnsi="Times New Roman" w:cs="Times New Roman"/>
+        <w:rFonts w:ascii="Times New Roman" w:hAnsi="Times New Roman" w:eastAsia="DFPYuanMedium-B5" w:cs="Times New Roman"/>
         <w:color w:val="000000"/>
         <w:sz w:val="24"/>
         <w:bdr w:val="none" w:sz="0" w:space="0" w:color="auto"/>
@@ -8219,7 +8220,7 @@
         <w:ind w:left="1440" w:hanging="360"/>
       </w:pPr>
       <w:rPr>
-        <w:rFonts w:ascii="Times New Roman" w:eastAsia="Times New Roman" w:hAnsi="Times New Roman" w:cs="Times New Roman"/>
+        <w:rFonts w:ascii="Times New Roman" w:hAnsi="Times New Roman" w:eastAsia="DFPYuanMedium-B5" w:cs="Times New Roman"/>
       </w:rPr>
     </w:lvl>
     <w:lvl w:ilvl="2">
@@ -8231,7 +8232,7 @@
         <w:ind w:left="2160" w:hanging="360"/>
       </w:pPr>
       <w:rPr>
-        <w:rFonts w:ascii="Times New Roman" w:eastAsia="Times New Roman" w:hAnsi="Times New Roman" w:cs="Times New Roman"/>
+        <w:rFonts w:ascii="Times New Roman" w:hAnsi="Times New Roman" w:eastAsia="DFPYuanMedium-B5" w:cs="Times New Roman"/>
       </w:rPr>
     </w:lvl>
     <w:lvl w:ilvl="3">
@@ -8243,7 +8244,7 @@
         <w:ind w:left="2880" w:hanging="360"/>
       </w:pPr>
       <w:rPr>
-        <w:rFonts w:ascii="Times New Roman" w:eastAsia="Times New Roman" w:hAnsi="Times New Roman" w:cs="Times New Roman"/>
+        <w:rFonts w:ascii="Times New Roman" w:hAnsi="Times New Roman" w:eastAsia="DFPYuanMedium-B5" w:cs="Times New Roman"/>
       </w:rPr>
     </w:lvl>
     <w:lvl w:ilvl="4">
@@ -8255,7 +8256,7 @@
         <w:ind w:left="3600" w:hanging="360"/>
       </w:pPr>
       <w:rPr>
-        <w:rFonts w:ascii="Times New Roman" w:eastAsia="Times New Roman" w:hAnsi="Times New Roman" w:cs="Times New Roman"/>
+        <w:rFonts w:ascii="Times New Roman" w:hAnsi="Times New Roman" w:eastAsia="DFPYuanMedium-B5" w:cs="Times New Roman"/>
       </w:rPr>
     </w:lvl>
     <w:lvl w:ilvl="5">
@@ -8267,7 +8268,7 @@
         <w:ind w:left="4320" w:hanging="360"/>
       </w:pPr>
       <w:rPr>
-        <w:rFonts w:ascii="Times New Roman" w:eastAsia="Times New Roman" w:hAnsi="Times New Roman" w:cs="Times New Roman"/>
+        <w:rFonts w:ascii="Times New Roman" w:hAnsi="Times New Roman" w:eastAsia="DFPYuanMedium-B5" w:cs="Times New Roman"/>
       </w:rPr>
     </w:lvl>
     <w:lvl w:ilvl="6">
@@ -8279,7 +8280,7 @@
         <w:ind w:left="5040" w:hanging="360"/>
       </w:pPr>
       <w:rPr>
-        <w:rFonts w:ascii="Times New Roman" w:eastAsia="Times New Roman" w:hAnsi="Times New Roman" w:cs="Times New Roman"/>
+        <w:rFonts w:ascii="Times New Roman" w:hAnsi="Times New Roman" w:eastAsia="DFPYuanMedium-B5" w:cs="Times New Roman"/>
       </w:rPr>
     </w:lvl>
     <w:lvl w:ilvl="7">
@@ -8291,7 +8292,7 @@
         <w:ind w:left="5760" w:hanging="360"/>
       </w:pPr>
       <w:rPr>
-        <w:rFonts w:ascii="Times New Roman" w:eastAsia="Times New Roman" w:hAnsi="Times New Roman" w:cs="Times New Roman"/>
+        <w:rFonts w:ascii="Times New Roman" w:hAnsi="Times New Roman" w:eastAsia="DFPYuanMedium-B5" w:cs="Times New Roman"/>
       </w:rPr>
     </w:lvl>
     <w:lvl w:ilvl="8">
@@ -8303,7 +8304,7 @@
         <w:ind w:left="6480" w:hanging="360"/>
       </w:pPr>
       <w:rPr>
-        <w:rFonts w:ascii="Times New Roman" w:eastAsia="Times New Roman" w:hAnsi="Times New Roman" w:cs="Times New Roman"/>
+        <w:rFonts w:ascii="Times New Roman" w:hAnsi="Times New Roman" w:eastAsia="DFPYuanMedium-B5" w:cs="Times New Roman"/>
       </w:rPr>
     </w:lvl>
   </w:abstractNum>
@@ -8320,7 +8321,7 @@
         <w:ind w:left="720" w:hanging="360"/>
       </w:pPr>
       <w:rPr>
-        <w:rFonts w:hint="default"/>
+        <w:rFonts w:ascii="Times New Roman" w:hAnsi="Times New Roman" w:eastAsia="DFPYuanMedium-B5" w:cs="Times New Roman"/>
       </w:rPr>
     </w:lvl>
     <w:lvl w:ilvl="1" w:tplc="FFFFFFFF" w:tentative="1">
@@ -8409,7 +8410,7 @@
         <w:ind w:left="1004" w:hanging="360"/>
       </w:pPr>
       <w:rPr>
-        <w:rFonts w:hint="eastAsia"/>
+        <w:rFonts w:ascii="Times New Roman" w:hAnsi="Times New Roman" w:eastAsia="DFPYuanMedium-B5" w:cs="Times New Roman"/>
         <w:i w:val="0"/>
         <w:iCs/>
       </w:rPr>
@@ -8500,7 +8501,7 @@
         <w:ind w:left="1631" w:hanging="360"/>
       </w:pPr>
       <w:rPr>
-        <w:rFonts w:hint="eastAsia"/>
+        <w:rFonts w:ascii="Times New Roman" w:hAnsi="Times New Roman" w:eastAsia="DFPYuanMedium-B5" w:cs="Times New Roman"/>
         <w:i w:val="0"/>
         <w:iCs/>
       </w:rPr>
@@ -8591,7 +8592,7 @@
         <w:ind w:left="360" w:hanging="360"/>
       </w:pPr>
       <w:rPr>
-        <w:rFonts w:hint="default"/>
+        <w:rFonts w:ascii="Times New Roman" w:hAnsi="Times New Roman" w:eastAsia="DFPYuanMedium-B5" w:cs="Times New Roman"/>
       </w:rPr>
     </w:lvl>
     <w:lvl w:ilvl="1" w:tplc="FFFFFFFF" w:tentative="1">
@@ -8734,7 +8735,7 @@
         <w:ind w:left="338" w:hanging="480"/>
       </w:pPr>
       <w:rPr>
-        <w:rFonts w:hint="eastAsia"/>
+        <w:rFonts w:ascii="Times New Roman" w:hAnsi="Times New Roman" w:eastAsia="DFPYuanMedium-B5" w:cs="Times New Roman"/>
         <w:i w:val="0"/>
         <w:iCs/>
       </w:rPr>
@@ -8825,7 +8826,7 @@
         <w:ind w:left="360" w:hanging="360"/>
       </w:pPr>
       <w:rPr>
-        <w:rFonts w:hint="default"/>
+        <w:rFonts w:ascii="Times New Roman" w:hAnsi="Times New Roman" w:eastAsia="DFPYuanMedium-B5" w:cs="Times New Roman"/>
       </w:rPr>
     </w:lvl>
     <w:lvl w:ilvl="1" w:tplc="FFFFFFFF" w:tentative="1">
@@ -8914,7 +8915,7 @@
         <w:ind w:left="480" w:hanging="480"/>
       </w:pPr>
       <w:rPr>
-        <w:rFonts w:hint="eastAsia"/>
+        <w:rFonts w:ascii="Times New Roman" w:hAnsi="Times New Roman" w:eastAsia="DFPYuanMedium-B5" w:cs="Times New Roman"/>
       </w:rPr>
     </w:lvl>
     <w:lvl w:ilvl="1" w:tplc="04090019" w:tentative="1">
@@ -9003,7 +9004,7 @@
         <w:ind w:left="720" w:hanging="360"/>
       </w:pPr>
       <w:rPr>
-        <w:rFonts w:hint="default"/>
+        <w:rFonts w:ascii="Times New Roman" w:hAnsi="Times New Roman" w:eastAsia="DFPYuanMedium-B5" w:cs="Times New Roman"/>
       </w:rPr>
     </w:lvl>
     <w:lvl w:ilvl="1" w:tplc="04090019" w:tentative="1">
@@ -9146,7 +9147,7 @@
         <w:ind w:left="720" w:hanging="360"/>
       </w:pPr>
       <w:rPr>
-        <w:rFonts w:hint="eastAsia"/>
+        <w:rFonts w:ascii="Times New Roman" w:hAnsi="Times New Roman" w:eastAsia="DFPYuanMedium-B5" w:cs="Times New Roman"/>
         <w:i w:val="0"/>
         <w:iCs/>
       </w:rPr>
@@ -9237,7 +9238,7 @@
         <w:ind w:left="1004" w:hanging="360"/>
       </w:pPr>
       <w:rPr>
-        <w:rFonts w:hint="eastAsia"/>
+        <w:rFonts w:ascii="Times New Roman" w:hAnsi="Times New Roman" w:eastAsia="DFPYuanMedium-B5" w:cs="Times New Roman"/>
         <w:i w:val="0"/>
         <w:iCs/>
       </w:rPr>
@@ -9414,7 +9415,7 @@
         <w:ind w:left="720" w:hanging="360"/>
       </w:pPr>
       <w:rPr>
-        <w:rFonts w:hint="eastAsia"/>
+        <w:rFonts w:ascii="Times New Roman" w:hAnsi="Times New Roman" w:eastAsia="DFPYuanMedium-B5" w:cs="Times New Roman"/>
         <w:i w:val="0"/>
         <w:iCs/>
       </w:rPr>
@@ -9505,7 +9506,7 @@
         <w:ind w:left="1146" w:hanging="360"/>
       </w:pPr>
       <w:rPr>
-        <w:rFonts w:hint="eastAsia"/>
+        <w:rFonts w:ascii="Times New Roman" w:hAnsi="Times New Roman" w:eastAsia="DFPYuanMedium-B5" w:cs="Times New Roman"/>
         <w:i w:val="0"/>
         <w:iCs/>
       </w:rPr>
@@ -9596,7 +9597,7 @@
         <w:ind w:left="720" w:hanging="360"/>
       </w:pPr>
       <w:rPr>
-        <w:rFonts w:hint="default"/>
+        <w:rFonts w:ascii="Times New Roman" w:hAnsi="Times New Roman" w:eastAsia="DFPYuanMedium-B5" w:cs="Times New Roman"/>
       </w:rPr>
     </w:lvl>
     <w:lvl w:ilvl="1" w:tplc="FFFFFFFF" w:tentative="1">
@@ -9685,7 +9686,7 @@
         <w:ind w:left="840" w:hanging="480"/>
       </w:pPr>
       <w:rPr>
-        <w:rFonts w:hint="eastAsia"/>
+        <w:rFonts w:ascii="Times New Roman" w:hAnsi="Times New Roman" w:eastAsia="DFPYuanMedium-B5" w:cs="Times New Roman"/>
         <w:i w:val="0"/>
         <w:iCs/>
       </w:rPr>
@@ -9776,7 +9777,7 @@
         <w:ind w:left="480" w:hanging="480"/>
       </w:pPr>
       <w:rPr>
-        <w:rFonts w:hint="eastAsia"/>
+        <w:rFonts w:ascii="Times New Roman" w:hAnsi="Times New Roman" w:eastAsia="DFPYuanMedium-B5" w:cs="Times New Roman"/>
       </w:rPr>
     </w:lvl>
     <w:lvl w:ilvl="1" w:tplc="04090019" w:tentative="1">
@@ -9864,7 +9865,7 @@
         <w:ind w:left="284" w:hanging="284"/>
       </w:pPr>
       <w:rPr>
-        <w:rFonts w:eastAsia="DFPYuanMedium-B5"/>
+        <w:rFonts w:ascii="Times New Roman" w:hAnsi="Times New Roman" w:eastAsia="DFPYuanMedium-B5" w:cs="Times New Roman"/>
         <w:sz w:val="20"/>
       </w:rPr>
     </w:lvl>
@@ -10216,7 +10217,7 @@
   <w:docDefaults>
     <w:rPrDefault>
       <w:rPr>
-        <w:rFonts w:asciiTheme="minorHAnsi" w:eastAsiaTheme="minorEastAsia" w:hAnsiTheme="minorHAnsi" w:cstheme="minorBidi"/>
+        <w:rFonts w:ascii="Times New Roman" w:hAnsi="Times New Roman" w:eastAsia="DFPYuanMedium-B5" w:cs="Times New Roman"/>
         <w:kern w:val="2"/>
         <w:sz w:val="24"/>
         <w:szCs w:val="24"/>
@@ -10617,7 +10618,7 @@
       <w:spacing w:after="0" w:line="240" w:lineRule="auto"/>
     </w:pPr>
     <w:rPr>
-      <w:rFonts w:ascii="Times New Roman" w:eastAsia="PMingLiU" w:hAnsi="Times New Roman" w:cs="Times New Roman"/>
+      <w:rFonts w:ascii="Times New Roman" w:hAnsi="Times New Roman" w:eastAsia="DFPYuanMedium-B5" w:cs="Times New Roman"/>
       <w:kern w:val="0"/>
       <w14:ligatures w14:val="none"/>
     </w:rPr>
@@ -10637,7 +10638,7 @@
       <w:outlineLvl w:val="0"/>
     </w:pPr>
     <w:rPr>
-      <w:rFonts w:asciiTheme="majorHAnsi" w:eastAsiaTheme="majorEastAsia" w:hAnsiTheme="majorHAnsi" w:cstheme="majorBidi"/>
+      <w:rFonts w:ascii="Times New Roman" w:hAnsi="Times New Roman" w:eastAsia="DFPYuanMedium-B5" w:cs="Times New Roman"/>
       <w:color w:val="0F4761" w:themeColor="accent1" w:themeShade="BF"/>
       <w:sz w:val="40"/>
       <w:szCs w:val="40"/>
@@ -10660,7 +10661,7 @@
       <w:outlineLvl w:val="1"/>
     </w:pPr>
     <w:rPr>
-      <w:rFonts w:asciiTheme="majorHAnsi" w:eastAsiaTheme="majorEastAsia" w:hAnsiTheme="majorHAnsi" w:cstheme="majorBidi"/>
+      <w:rFonts w:ascii="Times New Roman" w:hAnsi="Times New Roman" w:eastAsia="DFPYuanMedium-B5" w:cs="Times New Roman"/>
       <w:color w:val="0F4761" w:themeColor="accent1" w:themeShade="BF"/>
       <w:sz w:val="32"/>
       <w:szCs w:val="32"/>
@@ -10683,7 +10684,7 @@
       <w:outlineLvl w:val="2"/>
     </w:pPr>
     <w:rPr>
-      <w:rFonts w:eastAsiaTheme="majorEastAsia" w:cstheme="majorBidi"/>
+      <w:rFonts w:ascii="Times New Roman" w:hAnsi="Times New Roman" w:eastAsia="DFPYuanMedium-B5" w:cs="Times New Roman"/>
       <w:color w:val="0F4761" w:themeColor="accent1" w:themeShade="BF"/>
       <w:sz w:val="28"/>
       <w:szCs w:val="28"/>
@@ -10706,7 +10707,7 @@
       <w:outlineLvl w:val="3"/>
     </w:pPr>
     <w:rPr>
-      <w:rFonts w:eastAsiaTheme="majorEastAsia" w:cstheme="majorBidi"/>
+      <w:rFonts w:ascii="Times New Roman" w:hAnsi="Times New Roman" w:eastAsia="DFPYuanMedium-B5" w:cs="Times New Roman"/>
       <w:i/>
       <w:iCs/>
       <w:color w:val="0F4761" w:themeColor="accent1" w:themeShade="BF"/>
@@ -10729,7 +10730,7 @@
       <w:outlineLvl w:val="4"/>
     </w:pPr>
     <w:rPr>
-      <w:rFonts w:eastAsiaTheme="majorEastAsia" w:cstheme="majorBidi"/>
+      <w:rFonts w:ascii="Times New Roman" w:hAnsi="Times New Roman" w:eastAsia="DFPYuanMedium-B5" w:cs="Times New Roman"/>
       <w:color w:val="0F4761" w:themeColor="accent1" w:themeShade="BF"/>
     </w:rPr>
   </w:style>
@@ -10750,7 +10751,7 @@
       <w:outlineLvl w:val="5"/>
     </w:pPr>
     <w:rPr>
-      <w:rFonts w:eastAsiaTheme="majorEastAsia" w:cstheme="majorBidi"/>
+      <w:rFonts w:ascii="Times New Roman" w:hAnsi="Times New Roman" w:eastAsia="DFPYuanMedium-B5" w:cs="Times New Roman"/>
       <w:i/>
       <w:iCs/>
       <w:color w:val="595959" w:themeColor="text1" w:themeTint="A6"/>
@@ -10773,7 +10774,7 @@
       <w:outlineLvl w:val="6"/>
     </w:pPr>
     <w:rPr>
-      <w:rFonts w:eastAsiaTheme="majorEastAsia" w:cstheme="majorBidi"/>
+      <w:rFonts w:ascii="Times New Roman" w:hAnsi="Times New Roman" w:eastAsia="DFPYuanMedium-B5" w:cs="Times New Roman"/>
       <w:color w:val="595959" w:themeColor="text1" w:themeTint="A6"/>
     </w:rPr>
   </w:style>
@@ -10793,7 +10794,7 @@
       <w:outlineLvl w:val="7"/>
     </w:pPr>
     <w:rPr>
-      <w:rFonts w:eastAsiaTheme="majorEastAsia" w:cstheme="majorBidi"/>
+      <w:rFonts w:ascii="Times New Roman" w:hAnsi="Times New Roman" w:eastAsia="DFPYuanMedium-B5" w:cs="Times New Roman"/>
       <w:i/>
       <w:iCs/>
       <w:color w:val="272727" w:themeColor="text1" w:themeTint="D8"/>
@@ -10815,7 +10816,7 @@
       <w:outlineLvl w:val="8"/>
     </w:pPr>
     <w:rPr>
-      <w:rFonts w:eastAsiaTheme="majorEastAsia" w:cstheme="majorBidi"/>
+      <w:rFonts w:ascii="Times New Roman" w:hAnsi="Times New Roman" w:eastAsia="DFPYuanMedium-B5" w:cs="Times New Roman"/>
       <w:color w:val="272727" w:themeColor="text1" w:themeTint="D8"/>
     </w:rPr>
   </w:style>
@@ -10853,7 +10854,7 @@
     <w:uiPriority w:val="9"/>
     <w:rsid w:val="00EF2FD9"/>
     <w:rPr>
-      <w:rFonts w:asciiTheme="majorHAnsi" w:eastAsiaTheme="majorEastAsia" w:hAnsiTheme="majorHAnsi" w:cstheme="majorBidi"/>
+      <w:rFonts w:ascii="Times New Roman" w:hAnsi="Times New Roman" w:eastAsia="DFPYuanMedium-B5" w:cs="Times New Roman"/>
       <w:color w:val="0F4761" w:themeColor="accent1" w:themeShade="BF"/>
       <w:sz w:val="40"/>
       <w:szCs w:val="40"/>
@@ -10867,7 +10868,7 @@
     <w:semiHidden/>
     <w:rsid w:val="00EF2FD9"/>
     <w:rPr>
-      <w:rFonts w:asciiTheme="majorHAnsi" w:eastAsiaTheme="majorEastAsia" w:hAnsiTheme="majorHAnsi" w:cstheme="majorBidi"/>
+      <w:rFonts w:ascii="Times New Roman" w:hAnsi="Times New Roman" w:eastAsia="DFPYuanMedium-B5" w:cs="Times New Roman"/>
       <w:color w:val="0F4761" w:themeColor="accent1" w:themeShade="BF"/>
       <w:sz w:val="32"/>
       <w:szCs w:val="32"/>
@@ -10881,7 +10882,7 @@
     <w:semiHidden/>
     <w:rsid w:val="00EF2FD9"/>
     <w:rPr>
-      <w:rFonts w:eastAsiaTheme="majorEastAsia" w:cstheme="majorBidi"/>
+      <w:rFonts w:ascii="Times New Roman" w:hAnsi="Times New Roman" w:eastAsia="DFPYuanMedium-B5" w:cs="Times New Roman"/>
       <w:color w:val="0F4761" w:themeColor="accent1" w:themeShade="BF"/>
       <w:sz w:val="28"/>
       <w:szCs w:val="28"/>
@@ -10895,7 +10896,7 @@
     <w:semiHidden/>
     <w:rsid w:val="00EF2FD9"/>
     <w:rPr>
-      <w:rFonts w:eastAsiaTheme="majorEastAsia" w:cstheme="majorBidi"/>
+      <w:rFonts w:ascii="Times New Roman" w:hAnsi="Times New Roman" w:eastAsia="DFPYuanMedium-B5" w:cs="Times New Roman"/>
       <w:i/>
       <w:iCs/>
       <w:color w:val="0F4761" w:themeColor="accent1" w:themeShade="BF"/>
@@ -10909,7 +10910,7 @@
     <w:semiHidden/>
     <w:rsid w:val="00EF2FD9"/>
     <w:rPr>
-      <w:rFonts w:eastAsiaTheme="majorEastAsia" w:cstheme="majorBidi"/>
+      <w:rFonts w:ascii="Times New Roman" w:hAnsi="Times New Roman" w:eastAsia="DFPYuanMedium-B5" w:cs="Times New Roman"/>
       <w:color w:val="0F4761" w:themeColor="accent1" w:themeShade="BF"/>
     </w:rPr>
   </w:style>
@@ -10921,7 +10922,7 @@
     <w:semiHidden/>
     <w:rsid w:val="00EF2FD9"/>
     <w:rPr>
-      <w:rFonts w:eastAsiaTheme="majorEastAsia" w:cstheme="majorBidi"/>
+      <w:rFonts w:ascii="Times New Roman" w:hAnsi="Times New Roman" w:eastAsia="DFPYuanMedium-B5" w:cs="Times New Roman"/>
       <w:i/>
       <w:iCs/>
       <w:color w:val="595959" w:themeColor="text1" w:themeTint="A6"/>
@@ -10935,7 +10936,7 @@
     <w:semiHidden/>
     <w:rsid w:val="00EF2FD9"/>
     <w:rPr>
-      <w:rFonts w:eastAsiaTheme="majorEastAsia" w:cstheme="majorBidi"/>
+      <w:rFonts w:ascii="Times New Roman" w:hAnsi="Times New Roman" w:eastAsia="DFPYuanMedium-B5" w:cs="Times New Roman"/>
       <w:color w:val="595959" w:themeColor="text1" w:themeTint="A6"/>
     </w:rPr>
   </w:style>
@@ -10947,7 +10948,7 @@
     <w:semiHidden/>
     <w:rsid w:val="00EF2FD9"/>
     <w:rPr>
-      <w:rFonts w:eastAsiaTheme="majorEastAsia" w:cstheme="majorBidi"/>
+      <w:rFonts w:ascii="Times New Roman" w:hAnsi="Times New Roman" w:eastAsia="DFPYuanMedium-B5" w:cs="Times New Roman"/>
       <w:i/>
       <w:iCs/>
       <w:color w:val="272727" w:themeColor="text1" w:themeTint="D8"/>
@@ -10961,7 +10962,7 @@
     <w:semiHidden/>
     <w:rsid w:val="00EF2FD9"/>
     <w:rPr>
-      <w:rFonts w:eastAsiaTheme="majorEastAsia" w:cstheme="majorBidi"/>
+      <w:rFonts w:ascii="Times New Roman" w:hAnsi="Times New Roman" w:eastAsia="DFPYuanMedium-B5" w:cs="Times New Roman"/>
       <w:color w:val="272727" w:themeColor="text1" w:themeTint="D8"/>
     </w:rPr>
   </w:style>
@@ -10978,7 +10979,7 @@
       <w:contextualSpacing/>
     </w:pPr>
     <w:rPr>
-      <w:rFonts w:asciiTheme="majorHAnsi" w:eastAsiaTheme="majorEastAsia" w:hAnsiTheme="majorHAnsi" w:cstheme="majorBidi"/>
+      <w:rFonts w:ascii="Times New Roman" w:hAnsi="Times New Roman" w:eastAsia="DFPYuanMedium-B5" w:cs="Times New Roman"/>
       <w:spacing w:val="-10"/>
       <w:kern w:val="28"/>
       <w:sz w:val="56"/>
@@ -10992,7 +10993,7 @@
     <w:uiPriority w:val="10"/>
     <w:rsid w:val="00EF2FD9"/>
     <w:rPr>
-      <w:rFonts w:asciiTheme="majorHAnsi" w:eastAsiaTheme="majorEastAsia" w:hAnsiTheme="majorHAnsi" w:cstheme="majorBidi"/>
+      <w:rFonts w:ascii="Times New Roman" w:hAnsi="Times New Roman" w:eastAsia="DFPYuanMedium-B5" w:cs="Times New Roman"/>
       <w:spacing w:val="-10"/>
       <w:kern w:val="28"/>
       <w:sz w:val="56"/>
@@ -11013,7 +11014,7 @@
       </w:numPr>
     </w:pPr>
     <w:rPr>
-      <w:rFonts w:eastAsiaTheme="majorEastAsia" w:cstheme="majorBidi"/>
+      <w:rFonts w:ascii="Times New Roman" w:hAnsi="Times New Roman" w:eastAsia="DFPYuanMedium-B5" w:cs="Times New Roman"/>
       <w:color w:val="595959" w:themeColor="text1" w:themeTint="A6"/>
       <w:spacing w:val="15"/>
       <w:sz w:val="28"/>
@@ -11027,7 +11028,7 @@
     <w:uiPriority w:val="11"/>
     <w:rsid w:val="00EF2FD9"/>
     <w:rPr>
-      <w:rFonts w:eastAsiaTheme="majorEastAsia" w:cstheme="majorBidi"/>
+      <w:rFonts w:ascii="Times New Roman" w:hAnsi="Times New Roman" w:eastAsia="DFPYuanMedium-B5" w:cs="Times New Roman"/>
       <w:color w:val="595959" w:themeColor="text1" w:themeTint="A6"/>
       <w:spacing w:val="15"/>
       <w:sz w:val="28"/>
@@ -11166,7 +11167,7 @@
     <w:uiPriority w:val="99"/>
     <w:rsid w:val="001621CC"/>
     <w:rPr>
-      <w:rFonts w:ascii="Times New Roman" w:eastAsia="PMingLiU" w:hAnsi="Times New Roman" w:cs="Times New Roman"/>
+      <w:rFonts w:ascii="Times New Roman" w:hAnsi="Times New Roman" w:eastAsia="DFPYuanMedium-B5" w:cs="Times New Roman"/>
       <w:kern w:val="0"/>
       <w:lang w:val="en-US"/>
       <w14:ligatures w14:val="none"/>
@@ -11194,7 +11195,7 @@
     <w:uiPriority w:val="99"/>
     <w:rsid w:val="001621CC"/>
     <w:rPr>
-      <w:rFonts w:ascii="Times New Roman" w:eastAsia="PMingLiU" w:hAnsi="Times New Roman" w:cs="Times New Roman"/>
+      <w:rFonts w:ascii="Times New Roman" w:hAnsi="Times New Roman" w:eastAsia="DFPYuanMedium-B5" w:cs="Times New Roman"/>
       <w:kern w:val="0"/>
       <w:lang w:val="en-US"/>
       <w14:ligatures w14:val="none"/>
@@ -11230,7 +11231,7 @@
       <w:spacing w:before="100" w:beforeAutospacing="1" w:after="100" w:afterAutospacing="1"/>
     </w:pPr>
     <w:rPr>
-      <w:rFonts w:eastAsia="Times New Roman"/>
+      <w:rFonts w:ascii="Times New Roman" w:hAnsi="Times New Roman" w:eastAsia="DFPYuanMedium-B5" w:cs="Times New Roman"/>
     </w:rPr>
   </w:style>
   <w:style w:type="character" w:customStyle="1" w:styleId="apple-tab-span">
@@ -11255,7 +11256,7 @@
       <w:spacing w:after="0" w:line="240" w:lineRule="atLeast"/>
     </w:pPr>
     <w:rPr>
-      <w:rFonts w:ascii="Times New Roman" w:eastAsia="DFKai-SB" w:hAnsi="Times New Roman" w:cs="Times New Roman"/>
+      <w:rFonts w:ascii="Times New Roman" w:hAnsi="Times New Roman" w:eastAsia="DFPYuanMedium-B5" w:cs="Times New Roman"/>
       <w14:ligatures w14:val="none"/>
     </w:rPr>
   </w:style>
@@ -11269,7 +11270,7 @@
       <w:spacing w:after="0" w:line="240" w:lineRule="auto"/>
     </w:pPr>
     <w:rPr>
-      <w:rFonts w:ascii="Times New Roman" w:eastAsia="PMingLiU" w:hAnsi="Times New Roman" w:cs="Times New Roman"/>
+      <w:rFonts w:ascii="Times New Roman" w:hAnsi="Times New Roman" w:eastAsia="DFPYuanMedium-B5" w:cs="Times New Roman"/>
       <w:kern w:val="0"/>
       <w:sz w:val="20"/>
       <w:szCs w:val="20"/>
@@ -11314,7 +11315,7 @@
       <w:spacing w:after="0" w:line="240" w:lineRule="atLeast"/>
     </w:pPr>
     <w:rPr>
-      <w:rFonts w:ascii="Times New Roman" w:eastAsia="DFKai-SB" w:hAnsi="Times New Roman" w:cs="Times New Roman"/>
+      <w:rFonts w:ascii="Times New Roman" w:hAnsi="Times New Roman" w:eastAsia="DFPYuanMedium-B5" w:cs="Times New Roman"/>
       <w14:ligatures w14:val="none"/>
     </w:rPr>
   </w:style>
@@ -11356,7 +11357,7 @@
       <w:widowControl/>
     </w:pPr>
     <w:rPr>
-      <w:rFonts w:ascii="Helvetica" w:eastAsia="Times New Roman" w:hAnsi="Helvetica"/>
+      <w:rFonts w:ascii="Times New Roman" w:hAnsi="Times New Roman" w:eastAsia="DFPYuanMedium-B5" w:cs="Times New Roman"/>
       <w:color w:val="000000"/>
       <w:sz w:val="18"/>
       <w:szCs w:val="18"/>
@@ -11368,7 +11369,7 @@
     <w:basedOn w:val="DefaultParagraphFont"/>
     <w:rsid w:val="00A30A04"/>
     <w:rPr>
-      <w:rFonts w:ascii="Times New Roman" w:hAnsi="Times New Roman" w:cs="Times New Roman" w:hint="default"/>
+      <w:rFonts w:ascii="Times New Roman" w:hAnsi="Times New Roman" w:eastAsia="DFPYuanMedium-B5" w:cs="Times New Roman"/>
       <w:sz w:val="18"/>
       <w:szCs w:val="18"/>
     </w:rPr>
@@ -11402,7 +11403,7 @@
       <w:spacing w:after="0" w:line="240" w:lineRule="atLeast"/>
     </w:pPr>
     <w:rPr>
-      <w:rFonts w:ascii="Times New Roman" w:eastAsia="DFKai-SB" w:hAnsi="Times New Roman" w:cs="Times New Roman"/>
+      <w:rFonts w:ascii="Times New Roman" w:hAnsi="Times New Roman" w:eastAsia="DFPYuanMedium-B5" w:cs="Times New Roman"/>
       <w14:ligatures w14:val="none"/>
     </w:rPr>
   </w:style>
@@ -11416,7 +11417,7 @@
       <w:spacing w:after="0" w:line="240" w:lineRule="auto"/>
     </w:pPr>
     <w:rPr>
-      <w:rFonts w:ascii="Times New Roman" w:eastAsia="PMingLiU" w:hAnsi="Times New Roman" w:cs="Times New Roman"/>
+      <w:rFonts w:ascii="Times New Roman" w:hAnsi="Times New Roman" w:eastAsia="DFPYuanMedium-B5" w:cs="Times New Roman"/>
       <w:kern w:val="0"/>
       <w:sz w:val="20"/>
       <w:szCs w:val="20"/>
@@ -11440,7 +11441,7 @@
       <w:spacing w:after="0" w:line="240" w:lineRule="auto"/>
     </w:pPr>
     <w:rPr>
-      <w:rFonts w:ascii="Times New Roman" w:eastAsia="PMingLiU" w:hAnsi="Times New Roman" w:cs="Times New Roman"/>
+      <w:rFonts w:ascii="Times New Roman" w:hAnsi="Times New Roman" w:eastAsia="DFPYuanMedium-B5" w:cs="Times New Roman"/>
       <w:kern w:val="0"/>
       <w:sz w:val="20"/>
       <w:szCs w:val="20"/>
@@ -11465,7 +11466,7 @@
       <w:widowControl w:val="0"/>
     </w:pPr>
     <w:rPr>
-      <w:rFonts w:ascii="Times New Roman" w:hAnsi="Times New Roman" w:eastAsia="芫荽"/>
+      <w:rFonts w:ascii="Times New Roman" w:hAnsi="Times New Roman" w:eastAsia="DFPYuanMedium-B5" w:cs="Times New Roman"/>
       <w:sz w:val="24"/>
     </w:rPr>
   </w:style>
@@ -11493,7 +11494,7 @@
       <w:widowControl w:val="0"/>
     </w:pPr>
     <w:rPr>
-      <w:rFonts w:ascii="Times New Roman" w:eastAsia="Times New Roman" w:hAnsi="Times New Roman" w:cs="Times New Roman"/>
+      <w:rFonts w:ascii="Times New Roman" w:hAnsi="Times New Roman" w:eastAsia="DFPYuanMedium-B5" w:cs="Times New Roman"/>
       <w:kern w:val="0"/>
       <w:szCs w:val="24"/>
     </w:rPr>

</xml_diff>